<commit_message>
feat: complete cross-platform polarization analysis pipeline, dashboard, and reports
</commit_message>
<xml_diff>
--- a/docs/RGU_Research_Paper_Polarization.docx
+++ b/docs/RGU_Research_Paper_Polarization.docx
@@ -18,13 +18,8 @@
       </w:r>
     </w:p>
     <w:p>
-      <w:r>
-        <w:br w:type="page"/>
-      </w:r>
-    </w:p>
-    <w:p>
       <w:pPr>
-        <w:spacing w:line="276" w:lineRule="auto" w:after="120"/>
+        <w:spacing w:line="240" w:lineRule="auto" w:after="120"/>
         <w:jc w:val="both"/>
       </w:pPr>
       <w:r/>
@@ -38,7 +33,7 @@
     </w:p>
     <w:p>
       <w:pPr>
-        <w:spacing w:line="276" w:lineRule="auto" w:after="120"/>
+        <w:spacing w:line="240" w:lineRule="auto" w:after="120"/>
         <w:jc w:val="both"/>
       </w:pPr>
       <w:r/>
@@ -52,7 +47,7 @@
     </w:p>
     <w:p>
       <w:pPr>
-        <w:spacing w:line="276" w:lineRule="auto" w:after="120"/>
+        <w:spacing w:line="240" w:lineRule="auto" w:after="120"/>
         <w:jc w:val="both"/>
       </w:pPr>
       <w:r/>
@@ -66,7 +61,7 @@
     </w:p>
     <w:p>
       <w:pPr>
-        <w:spacing w:line="276" w:lineRule="auto" w:after="120"/>
+        <w:spacing w:line="240" w:lineRule="auto" w:after="120"/>
         <w:jc w:val="both"/>
       </w:pPr>
       <w:r/>
@@ -80,7 +75,7 @@
     </w:p>
     <w:p>
       <w:pPr>
-        <w:spacing w:line="276" w:lineRule="auto" w:after="120"/>
+        <w:spacing w:line="240" w:lineRule="auto" w:after="120"/>
         <w:jc w:val="both"/>
       </w:pPr>
       <w:r/>
@@ -88,13 +83,13 @@
         <w:rPr>
           <w:b/>
         </w:rPr>
-        <w:t>Dr. John Smith</w:t>
+        <w:t>Dr. Shahana Bano</w:t>
       </w:r>
       <w:r/>
     </w:p>
     <w:p>
       <w:pPr>
-        <w:spacing w:line="276" w:lineRule="auto" w:after="120"/>
+        <w:spacing w:line="240" w:lineRule="auto" w:after="120"/>
         <w:jc w:val="both"/>
       </w:pPr>
       <w:r/>
@@ -108,7 +103,7 @@
     </w:p>
     <w:p>
       <w:pPr>
-        <w:spacing w:line="276" w:lineRule="auto" w:after="120"/>
+        <w:spacing w:line="240" w:lineRule="auto" w:after="120"/>
         <w:jc w:val="both"/>
       </w:pPr>
       <w:r/>
@@ -116,14 +111,9 @@
         <w:rPr>
           <w:i/>
         </w:rPr>
-        <w:t>Email: j.smith4@rgu.ac.uk</w:t>
+        <w:t>Email: s.bano@rgu.ac.uk</w:t>
       </w:r>
       <w:r/>
-    </w:p>
-    <w:p>
-      <w:r>
-        <w:br w:type="page"/>
-      </w:r>
     </w:p>
     <w:p>
       <w:pPr>
@@ -141,7 +131,7 @@
     </w:p>
     <w:p>
       <w:pPr>
-        <w:spacing w:line="276" w:lineRule="auto" w:after="120"/>
+        <w:spacing w:line="240" w:lineRule="auto" w:after="120"/>
         <w:jc w:val="both"/>
       </w:pPr>
       <w:r>
@@ -150,7 +140,7 @@
     </w:p>
     <w:p>
       <w:pPr>
-        <w:spacing w:line="276" w:lineRule="auto" w:after="120"/>
+        <w:spacing w:line="240" w:lineRule="auto" w:after="120"/>
         <w:jc w:val="both"/>
       </w:pPr>
       <w:r/>
@@ -162,11 +152,6 @@
       </w:r>
       <w:r>
         <w:t>: Multimodal Analysis, Natural Language Processing, Social Network Analysis, Louvain Modularity, Echo Chambers, Discursive Polarization.</w:t>
-      </w:r>
-    </w:p>
-    <w:p>
-      <w:r>
-        <w:br w:type="page"/>
       </w:r>
     </w:p>
     <w:p>
@@ -185,25 +170,25 @@
     </w:p>
     <w:p>
       <w:pPr>
-        <w:spacing w:line="276" w:lineRule="auto" w:after="120"/>
+        <w:spacing w:line="240" w:lineRule="auto" w:after="120"/>
         <w:jc w:val="both"/>
       </w:pPr>
       <w:r>
-        <w:t>The rapid expansion of social media platforms as primary vectors of public debate has significantly altered democratic communication. While these networks theoretically offer decentralized spaces for democratic discourse, algorithmic sorting mechanisms designed to maximize user engagement have inadvertently accelerated ideological fragmentation. Online interactions are frequently characterized by "us versus them" group dynamics, commonly referred to in social psychology as in-group favoritism and out-group hostility.</w:t>
+        <w:t>The rapid expansion of social media platforms as primary vectors of public debate has significantly altered democratic communication. While these networks theoretically offer decentralized spaces for democratic discourse, algorithmic sorting mechanisms designed to maximize user engagement have inadvertently accelerated ideological fragmentation. Online interactions are frequently characterized by "us versus them" group dynamics, commonly referred to in social psychology as in-group favoritism and out-group hostility. Within these environments, users actively construct hermetic discussion groups—commonly designated as "echo chambers"—wherein exposure to opposing viewpoints is heavily suppressed. This isolation is not merely topological but highly discursive; as groups isolate themselves, their internal vocabulary becomes self-referential, tribal, and hostile toward external entities. Developing methodologies to detect and monitor these dynamics is crucial for computational social science and content moderation.</w:t>
       </w:r>
     </w:p>
     <w:p>
       <w:pPr>
-        <w:spacing w:line="276" w:lineRule="auto" w:after="120"/>
+        <w:spacing w:line="240" w:lineRule="auto" w:after="120"/>
         <w:jc w:val="both"/>
       </w:pPr>
       <w:r>
-        <w:t>Within these environments, users actively construct hermetic discussion groups—commonly designated as "echo chambers"—wherein exposure to opposing viewpoints is heavily suppressed. This isolation is not merely topological but highly discursive; as groups isolate themselves, their internal vocabulary becomes self-referential, tribal, and hostile toward external entities. Developing methodologies to detect and monitor these dynamics is crucial for computing social science and content moderation.</w:t>
+        <w:t>To model and quantify these complex dynamics, this study builds upon several key methodologies established in recent literature. Structural partition algorithms, particularly the fast Louvain community detection proposed by Blondel et al. [2], form the basis of our structural echo-chamber analysis, while Conover et al. [5] provide a foundational framework for analyzing ideological polarization in microblogging topologies. Discursively, Jigsaw's Perspective API [4] serves as a benchmark for scoring contextual sentence toxicity, and Radford et al. [3] outline the CLIP model used for visual-textual alignment in political memes. Finally, visual diagnostics draw inspiration from network exploration interfaces pioneered by Bastian et al. [1] to display large-scale graph compositions.</w:t>
       </w:r>
     </w:p>
     <w:p>
       <w:pPr>
-        <w:spacing w:line="276" w:lineRule="auto" w:after="120"/>
+        <w:spacing w:line="240" w:lineRule="auto" w:after="120"/>
         <w:jc w:val="both"/>
       </w:pPr>
       <w:r>
@@ -212,7 +197,7 @@
     </w:p>
     <w:p>
       <w:pPr>
-        <w:spacing w:line="276" w:lineRule="auto" w:after="120"/>
+        <w:spacing w:line="240" w:lineRule="auto" w:after="120"/>
         <w:ind w:left="576"/>
       </w:pPr>
       <w:r>
@@ -234,7 +219,7 @@
     </w:p>
     <w:p>
       <w:pPr>
-        <w:spacing w:line="276" w:lineRule="auto" w:after="120"/>
+        <w:spacing w:line="240" w:lineRule="auto" w:after="120"/>
         <w:ind w:left="576"/>
       </w:pPr>
       <w:r>
@@ -256,7 +241,7 @@
     </w:p>
     <w:p>
       <w:pPr>
-        <w:spacing w:line="276" w:lineRule="auto" w:after="120"/>
+        <w:spacing w:line="240" w:lineRule="auto" w:after="120"/>
         <w:jc w:val="both"/>
       </w:pPr>
       <w:r>
@@ -265,7 +250,7 @@
     </w:p>
     <w:p>
       <w:pPr>
-        <w:spacing w:line="276" w:lineRule="auto" w:after="120"/>
+        <w:spacing w:line="240" w:lineRule="auto" w:after="120"/>
         <w:ind w:left="576"/>
       </w:pPr>
       <w:r>
@@ -298,7 +283,7 @@
     </w:p>
     <w:p>
       <w:pPr>
-        <w:spacing w:line="276" w:lineRule="auto" w:after="120"/>
+        <w:spacing w:line="240" w:lineRule="auto" w:after="120"/>
         <w:ind w:left="576"/>
       </w:pPr>
       <w:r>
@@ -333,7 +318,7 @@
     </w:p>
     <w:p>
       <w:pPr>
-        <w:spacing w:line="276" w:lineRule="auto" w:after="120"/>
+        <w:spacing w:line="240" w:lineRule="auto" w:after="120"/>
         <w:ind w:left="576"/>
       </w:pPr>
       <w:r>
@@ -356,8 +341,53 @@
       </w:r>
     </w:p>
     <w:p>
-      <w:r>
-        <w:br w:type="page"/>
+      <w:pPr>
+        <w:spacing w:before="240" w:after="120"/>
+      </w:pPr>
+      <w:r>
+        <w:rPr>
+          <w:rFonts w:ascii="Calibri" w:hAnsi="Calibri"/>
+          <w:b/>
+          <w:color w:val="3B82F6"/>
+          <w:sz w:val="24"/>
+        </w:rPr>
+        <w:t>A. Theoretical Context and Related Work</w:t>
+      </w:r>
+    </w:p>
+    <w:p>
+      <w:pPr>
+        <w:spacing w:line="240" w:lineRule="auto" w:after="120"/>
+        <w:jc w:val="both"/>
+      </w:pPr>
+      <w:r>
+        <w:t>The quantification of online polarization has historically been pursued along two distinct paths: text-based Natural Language Processing (NLP) and graph-based Social Network Analysis (SNA).</w:t>
+      </w:r>
+    </w:p>
+    <w:p>
+      <w:pPr>
+        <w:spacing w:line="240" w:lineRule="auto" w:after="120"/>
+        <w:jc w:val="both"/>
+      </w:pPr>
+      <w:r>
+        <w:t>In NLP, early baseline sentiment studies relied heavily on lexicons such as VADER or LIWC. While computationally efficient, lexical matching exhibits severe limitations when applied to political discourse. It fails to resolve sarcastic remarks or contextual shifts where negative vocabulary does not indicate actual hostility. To bypass this, recent architectures utilize deep learning models (such as BERT or Google Jigsaw's Perspective API) to score text toxicity by evaluating complete sentence sequences and contextual representations.</w:t>
+      </w:r>
+    </w:p>
+    <w:p>
+      <w:pPr>
+        <w:spacing w:line="240" w:lineRule="auto" w:after="120"/>
+        <w:jc w:val="both"/>
+      </w:pPr>
+      <w:r>
+        <w:t>In SNA, polarization is modeled as a topological property. Researchers represent online users as nodes and interactions (retweets, mentions, replies) as edges. A common approach to identifying echo chambers is detecting dense communities using partitioning algorithms. The Louvain heuristic is widely recognized for its efficiency in maximizing network modularity. However, most existing SNA frameworks analyze platforms in isolation, omitting the multi-platform nature of modern information ecosystems.</w:t>
+      </w:r>
+    </w:p>
+    <w:p>
+      <w:pPr>
+        <w:spacing w:line="240" w:lineRule="auto" w:after="120"/>
+        <w:jc w:val="both"/>
+      </w:pPr>
+      <w:r>
+        <w:t>Furthermore, political rhetoric has evolved beyond pure text into multimodal formats. The proliferation of political memes—where image and text are combined satirically—requires models capable of processing visual and textual features jointly. OpenAI's CLIP (Contrastive Language-Image Pre-training) model has emerged as a state-of-the-art solution, projecting images and text into a shared high-dimensional vector space, enabling direct cosine similarity calculations and zero-shot image classification without explicit downstream training. This paper unifies these computational domains into a single, cohesive cross-platform architecture.</w:t>
       </w:r>
     </w:p>
     <w:p>
@@ -371,48 +401,16 @@
           <w:color w:val="3B82F6"/>
           <w:sz w:val="28"/>
         </w:rPr>
-        <w:t>II. RELATED WORK</w:t>
+        <w:t>II. METHODOLOGY</w:t>
       </w:r>
     </w:p>
     <w:p>
       <w:pPr>
-        <w:spacing w:line="276" w:lineRule="auto" w:after="120"/>
+        <w:spacing w:line="240" w:lineRule="auto" w:after="120"/>
         <w:jc w:val="both"/>
       </w:pPr>
       <w:r>
-        <w:t>The quantification of online polarization has historically been pursued along two distinct paths: text-based NLP and graph-based Social Network Analysis (SNA).</w:t>
-      </w:r>
-    </w:p>
-    <w:p>
-      <w:pPr>
-        <w:spacing w:line="276" w:lineRule="auto" w:after="120"/>
-        <w:jc w:val="both"/>
-      </w:pPr>
-      <w:r>
-        <w:t>In NLP, early baseline sentiment studies relied heavily on lexicons such as VADER or LIWC. While computationally efficient, lexical matching exhibits severe limitations when applied to political discourse. It fails to resolve sarcastic remarks or contextual shifts where negative vocabulary does not indicate actual hostility. To bypass this, recent architectures utilize deep learning models (such as BERT or Google Jigsaw's Perspective API) to score text toxicity by evaluating complete sentence sequences and contextual representations.</w:t>
-      </w:r>
-    </w:p>
-    <w:p>
-      <w:pPr>
-        <w:spacing w:line="276" w:lineRule="auto" w:after="120"/>
-        <w:jc w:val="both"/>
-      </w:pPr>
-      <w:r>
-        <w:t>In SNA, polarization is modeled as a topological property. Researchers represent online users as nodes and interactions (retweets, mentions, replies) as edges. A common approach to identifying echo chambers is detecting dense communities using partitioning algorithms. The Louvain heuristic is widely recognized for its efficiency in maximizing network modularity. However, most existing SNA frameworks analyze platforms in isolation, omitting the multi-platform nature of modern information ecosystems.</w:t>
-      </w:r>
-    </w:p>
-    <w:p>
-      <w:pPr>
-        <w:spacing w:line="276" w:lineRule="auto" w:after="120"/>
-        <w:jc w:val="both"/>
-      </w:pPr>
-      <w:r>
-        <w:t>Furthermore, political rhetoric has evolved beyond pure text into multimodal formats. The proliferation of political memes—where image and text are combined satirically—requires models capable of processing visual and textual features jointly. OpenAI's CLIP (Contrastive Language-Image Pre-training) model has emerged as a state-of-the-art solution, projecting images and text into a shared high-dimensional vector space, enabling direct cosine similarity calculations and zero-shot image classification without explicit downstream training. This paper unifies these computational domains into a single, cohesive cross-platform architecture.</w:t>
-      </w:r>
-    </w:p>
-    <w:p>
-      <w:r>
-        <w:br w:type="page"/>
+        <w:t>Our engineering architecture and mathematical framework are structured to ingest heterogeneous social media data, clean it, model user topologies, evaluate linguistic dynamics, and visualize metrics through an optimized dashboard. The pipeline operates across four main processing layers: the Data Curation and Cleaning Layer, the Complex Network Layer, the Natural Language Processing (NLP) Layer, and the Multimodal Analysis Layer.</w:t>
       </w:r>
     </w:p>
     <w:p>
@@ -424,18 +422,18 @@
           <w:rFonts w:ascii="Calibri" w:hAnsi="Calibri"/>
           <w:b/>
           <w:color w:val="3B82F6"/>
-          <w:sz w:val="28"/>
+          <w:sz w:val="24"/>
         </w:rPr>
-        <w:t>III. PROPOSED METHODOLOGY</w:t>
+        <w:t>A. System Architecture and Workflow</w:t>
       </w:r>
     </w:p>
     <w:p>
       <w:pPr>
-        <w:spacing w:line="276" w:lineRule="auto" w:after="120"/>
+        <w:spacing w:line="240" w:lineRule="auto" w:after="120"/>
         <w:jc w:val="both"/>
       </w:pPr>
       <w:r>
-        <w:t>The architecture of our unified social media polarization pipeline is structured into four main processing stages, detailed below:</w:t>
+        <w:t>The high-level data flow and processing stages are illustrated in the architecture diagram below:</w:t>
       </w:r>
     </w:p>
     <w:p>
@@ -504,21 +502,21 @@
           <w:color w:val="3B82F6"/>
           <w:sz w:val="24"/>
         </w:rPr>
-        <w:t>A. Data Engineering &amp; Cleaning Pipeline</w:t>
+        <w:t>B. Dataset Acquisition (2.1 Dataset: Where did we get them)</w:t>
       </w:r>
     </w:p>
     <w:p>
       <w:pPr>
-        <w:spacing w:line="276" w:lineRule="auto" w:after="120"/>
+        <w:spacing w:line="240" w:lineRule="auto" w:after="120"/>
         <w:jc w:val="both"/>
       </w:pPr>
       <w:r>
-        <w:t>Data ingested from Reddit, YouTube, Twitter, and Instagram is standardly structured into a unified data schema consisting of three primary tables: `posts`, `nlp_features`, and `network_features`. To ensure high-quality inputs, raw text strings undergo a sequential three-step cleaning process:</w:t>
+        <w:t>To build a representative cross-platform model, we compiled datasets from four prominent social media platforms:</w:t>
       </w:r>
     </w:p>
     <w:p>
       <w:pPr>
-        <w:spacing w:line="276" w:lineRule="auto" w:after="120"/>
+        <w:spacing w:line="240" w:lineRule="auto" w:after="120"/>
         <w:ind w:left="576"/>
       </w:pPr>
       <w:r>
@@ -532,15 +530,42 @@
         <w:rPr>
           <w:b/>
         </w:rPr>
-        <w:t>Corrupt Record Removal</w:t>
-      </w:r>
-      <w:r>
-        <w:t>: Dropping rows with null text bodies or containing fewer than three characters.</w:t>
+        <w:t>Reddit</w:t>
+      </w:r>
+      <w:r>
+        <w:t xml:space="preserve">: We acquired political discourse records from the Hugging Face hub repository `mo-mittal/reddit_political_subs`. This corpus aggregates discussions from highly active political subreddits (e.g., </w:t>
+      </w:r>
+      <w:r>
+        <w:rPr>
+          <w:i/>
+        </w:rPr>
+        <w:t>r/politics</w:t>
+      </w:r>
+      <w:r>
+        <w:t xml:space="preserve">, </w:t>
+      </w:r>
+      <w:r>
+        <w:rPr>
+          <w:i/>
+        </w:rPr>
+        <w:t>r/Conservative</w:t>
+      </w:r>
+      <w:r>
+        <w:t xml:space="preserve">, </w:t>
+      </w:r>
+      <w:r>
+        <w:rPr>
+          <w:i/>
+        </w:rPr>
+        <w:t>r/progressive</w:t>
+      </w:r>
+      <w:r>
+        <w:t>), representing polarized ideologues.</w:t>
       </w:r>
     </w:p>
     <w:p>
       <w:pPr>
-        <w:spacing w:line="276" w:lineRule="auto" w:after="120"/>
+        <w:spacing w:line="240" w:lineRule="auto" w:after="120"/>
         <w:ind w:left="576"/>
       </w:pPr>
       <w:r>
@@ -554,15 +579,15 @@
         <w:rPr>
           <w:b/>
         </w:rPr>
-        <w:t>Duplicate Stripping</w:t>
-      </w:r>
-      <w:r>
-        <w:t>: Removing identical text comments to eliminate spam and prevent skewing word frequency counts.</w:t>
+        <w:t>YouTube</w:t>
+      </w:r>
+      <w:r>
+        <w:t>: Programmatic comments were harvested from ten prominent BBC News video threads focused on the Israel-Gaza conflict using the `yt-dlp` tool. This specific dataset serves as a benchmark for high-engagement, real-time controversy.</w:t>
       </w:r>
     </w:p>
     <w:p>
       <w:pPr>
-        <w:spacing w:line="276" w:lineRule="auto" w:after="120"/>
+        <w:spacing w:line="240" w:lineRule="auto" w:after="120"/>
         <w:ind w:left="576"/>
       </w:pPr>
       <w:r>
@@ -576,10 +601,54 @@
         <w:rPr>
           <w:b/>
         </w:rPr>
-        <w:t>Language Isolation</w:t>
-      </w:r>
-      <w:r>
-        <w:t>: Applying the `langdetect` library to filter out non-English content, ensuring linguistic uniformity for downstream NLP models.</w:t>
+        <w:t>Twitter (X)</w:t>
+      </w:r>
+      <w:r>
+        <w:t>: We utilized the academic dataset `twitter_we-language_dataset.csv`, which contains tweets specifically curated to evaluate polarization through linguistic markers (in-group and out-group terms).</w:t>
+      </w:r>
+    </w:p>
+    <w:p>
+      <w:pPr>
+        <w:spacing w:line="240" w:lineRule="auto" w:after="120"/>
+        <w:ind w:left="576"/>
+      </w:pPr>
+      <w:r>
+        <w:rPr>
+          <w:b/>
+        </w:rPr>
+        <w:t xml:space="preserve">4.  </w:t>
+      </w:r>
+      <w:r/>
+      <w:r>
+        <w:rPr>
+          <w:b/>
+        </w:rPr>
+        <w:t>Instagram</w:t>
+      </w:r>
+      <w:r>
+        <w:t>: Discussion threads and replies were extracted from `instagram_dataset.csv` and `instagram_comments_dataset.csv`. These records highlight mobile-first, visual-oriented user interactions.</w:t>
+      </w:r>
+    </w:p>
+    <w:p>
+      <w:pPr>
+        <w:spacing w:line="240" w:lineRule="auto" w:after="120"/>
+        <w:ind w:left="576"/>
+      </w:pPr>
+      <w:r>
+        <w:rPr>
+          <w:b/>
+        </w:rPr>
+        <w:t xml:space="preserve">5.  </w:t>
+      </w:r>
+      <w:r/>
+      <w:r>
+        <w:rPr>
+          <w:b/>
+        </w:rPr>
+        <w:t>Hateful Memes</w:t>
+      </w:r>
+      <w:r>
+        <w:t>: To evaluate multimodal polarization, we extracted a training subset of 2,000 political memes containing visual data and corresponding overlay texts from the Hugging Face repository `cs5242-hateful-memes/hateful-memes-data` (originally published by Meta AI).</w:t>
       </w:r>
     </w:p>
     <w:p>
@@ -593,25 +662,338 @@
           <w:color w:val="3B82F6"/>
           <w:sz w:val="24"/>
         </w:rPr>
-        <w:t>B. Multimodal Representation &amp; Alignment (CLIP)</w:t>
+        <w:t>C. Feature Processing (2.2 How many features processing)</w:t>
       </w:r>
     </w:p>
     <w:p>
       <w:pPr>
-        <w:spacing w:line="276" w:lineRule="auto" w:after="120"/>
+        <w:spacing w:line="240" w:lineRule="auto" w:after="120"/>
         <w:jc w:val="both"/>
       </w:pPr>
       <w:r>
-        <w:t xml:space="preserve">For satirical political memes, we deploy a local instance of the </w:t>
-      </w:r>
+        <w:t>Our data schema ingests raw platform payloads and transforms them into standardized features across three primary relational tables: `posts`, `nlp_features`, and `network_features`. The processing pipeline extracts and calculates the following features:</w:t>
+      </w:r>
+    </w:p>
+    <w:p>
+      <w:pPr>
+        <w:spacing w:line="240" w:lineRule="auto" w:after="120"/>
+        <w:ind w:left="576"/>
+      </w:pPr>
       <w:r>
         <w:rPr>
           <w:b/>
         </w:rPr>
-        <w:t>CLIP (clip-vit-base-patch32)</w:t>
-      </w:r>
-      <w:r>
-        <w:t xml:space="preserve"> transformer. To analyze the relationship between the meme's image and its embedded text overlay, we project the image and text into a joint embedding space. The semantic alignment is quantified by calculating the cosine similarity between the normalized image vector </w:t>
+        <w:t xml:space="preserve">1.  </w:t>
+      </w:r>
+      <w:r/>
+      <w:r>
+        <w:rPr>
+          <w:b/>
+        </w:rPr>
+        <w:t>Linguistic and NLP Features</w:t>
+      </w:r>
+      <w:r>
+        <w:t>:</w:t>
+      </w:r>
+    </w:p>
+    <w:p>
+      <w:pPr>
+        <w:spacing w:line="240" w:lineRule="auto" w:after="120"/>
+        <w:ind w:left="576"/>
+      </w:pPr>
+      <w:r>
+        <w:rPr>
+          <w:b/>
+        </w:rPr>
+        <w:t xml:space="preserve">•  </w:t>
+      </w:r>
+      <w:r>
+        <w:t xml:space="preserve">  </w:t>
+      </w:r>
+      <w:r>
+        <w:rPr>
+          <w:i/>
+        </w:rPr>
+        <w:t>Raw text and Cleaned text</w:t>
+      </w:r>
+      <w:r>
+        <w:t>: Input strings stripped of URLs, HTML tags, and non-ASCII markers.</w:t>
+      </w:r>
+    </w:p>
+    <w:p>
+      <w:pPr>
+        <w:spacing w:line="240" w:lineRule="auto" w:after="120"/>
+        <w:ind w:left="576"/>
+      </w:pPr>
+      <w:r>
+        <w:rPr>
+          <w:b/>
+        </w:rPr>
+        <w:t xml:space="preserve">•  </w:t>
+      </w:r>
+      <w:r>
+        <w:t xml:space="preserve">  </w:t>
+      </w:r>
+      <w:r>
+        <w:rPr>
+          <w:i/>
+        </w:rPr>
+        <w:t>Language label</w:t>
+      </w:r>
+      <w:r>
+        <w:t xml:space="preserve">: Isolated using the `langdetect` library, filtering out any records where language </w:t>
+      </w:r>
+      <w:r>
+        <w:rPr>
+          <w:rFonts w:ascii="Consolas" w:hAnsi="Consolas"/>
+          <w:color w:val="781414"/>
+          <w:sz w:val="20"/>
+        </w:rPr>
+        <w:t>\neq</w:t>
+      </w:r>
+      <w:r>
+        <w:t xml:space="preserve"> `'en'`.</w:t>
+      </w:r>
+    </w:p>
+    <w:p>
+      <w:pPr>
+        <w:spacing w:line="240" w:lineRule="auto" w:after="120"/>
+        <w:ind w:left="576"/>
+      </w:pPr>
+      <w:r>
+        <w:rPr>
+          <w:b/>
+        </w:rPr>
+        <w:t xml:space="preserve">•  </w:t>
+      </w:r>
+      <w:r>
+        <w:t xml:space="preserve">  </w:t>
+      </w:r>
+      <w:r>
+        <w:rPr>
+          <w:i/>
+        </w:rPr>
+        <w:t>In-group Pronoun Count ($C_{we}$)</w:t>
+      </w:r>
+      <w:r>
+        <w:t xml:space="preserve">: Occurrences of terms within the set </w:t>
+      </w:r>
+      <w:r>
+        <w:rPr>
+          <w:rFonts w:ascii="Consolas" w:hAnsi="Consolas"/>
+          <w:color w:val="781414"/>
+          <w:sz w:val="20"/>
+        </w:rPr>
+        <w:t>\text{We} = \{\text{we, us, our, ours, ourselves}\}</w:t>
+      </w:r>
+      <w:r>
+        <w:t>.</w:t>
+      </w:r>
+    </w:p>
+    <w:p>
+      <w:pPr>
+        <w:spacing w:line="240" w:lineRule="auto" w:after="120"/>
+        <w:ind w:left="576"/>
+      </w:pPr>
+      <w:r>
+        <w:rPr>
+          <w:b/>
+        </w:rPr>
+        <w:t xml:space="preserve">•  </w:t>
+      </w:r>
+      <w:r>
+        <w:t xml:space="preserve">  </w:t>
+      </w:r>
+      <w:r>
+        <w:rPr>
+          <w:i/>
+        </w:rPr>
+        <w:t>Out-group Pronoun Count ($C_{them}$)</w:t>
+      </w:r>
+      <w:r>
+        <w:t xml:space="preserve">: Occurrences of terms within the set </w:t>
+      </w:r>
+      <w:r>
+        <w:rPr>
+          <w:rFonts w:ascii="Consolas" w:hAnsi="Consolas"/>
+          <w:color w:val="781414"/>
+          <w:sz w:val="20"/>
+        </w:rPr>
+        <w:t>\text{Them} = \{\text{they, them, their, theirs, themselves}\}</w:t>
+      </w:r>
+      <w:r>
+        <w:t>.</w:t>
+      </w:r>
+    </w:p>
+    <w:p>
+      <w:pPr>
+        <w:spacing w:line="240" w:lineRule="auto" w:after="120"/>
+        <w:ind w:left="576"/>
+      </w:pPr>
+      <w:r>
+        <w:rPr>
+          <w:b/>
+        </w:rPr>
+        <w:t xml:space="preserve">•  </w:t>
+      </w:r>
+      <w:r>
+        <w:t xml:space="preserve">  </w:t>
+      </w:r>
+      <w:r>
+        <w:rPr>
+          <w:i/>
+        </w:rPr>
+        <w:t>We/Them Ratio ($R_{we\_them}$)</w:t>
+      </w:r>
+      <w:r>
+        <w:t>: Structured as:</w:t>
+      </w:r>
+    </w:p>
+    <w:p>
+      <w:pPr>
+        <w:spacing w:line="240" w:lineRule="auto" w:after="160" w:before="160"/>
+        <w:jc w:val="center"/>
+      </w:pPr>
+      <w:r>
+        <w:t>R_{we\_them} = \frac{C_{we}}{\max(1, C_{them})}</w:t>
+      </w:r>
+    </w:p>
+    <w:p>
+      <w:pPr>
+        <w:spacing w:line="240" w:lineRule="auto" w:after="120"/>
+        <w:ind w:left="576"/>
+      </w:pPr>
+      <w:r>
+        <w:rPr>
+          <w:b/>
+        </w:rPr>
+        <w:t xml:space="preserve">•  </w:t>
+      </w:r>
+      <w:r>
+        <w:t xml:space="preserve">  </w:t>
+      </w:r>
+      <w:r>
+        <w:rPr>
+          <w:i/>
+        </w:rPr>
+        <w:t>Toxicity Score ($T_c$)</w:t>
+      </w:r>
+      <w:r>
+        <w:t>: A probability score (</w:t>
+      </w:r>
+      <w:r>
+        <w:rPr>
+          <w:rFonts w:ascii="Consolas" w:hAnsi="Consolas"/>
+          <w:color w:val="781414"/>
+          <w:sz w:val="20"/>
+        </w:rPr>
+        <w:t>[0.0, 1.0]</w:t>
+      </w:r>
+      <w:r>
+        <w:t>) queried from Google's Perspective API indicating the likelihood that a comment is perceived as toxic, insulting, or hostile.</w:t>
+      </w:r>
+    </w:p>
+    <w:p>
+      <w:pPr>
+        <w:spacing w:line="240" w:lineRule="auto" w:after="120"/>
+        <w:ind w:left="576"/>
+      </w:pPr>
+      <w:r>
+        <w:rPr>
+          <w:b/>
+        </w:rPr>
+        <w:t xml:space="preserve">•  </w:t>
+      </w:r>
+      <w:r>
+        <w:t xml:space="preserve">  </w:t>
+      </w:r>
+      <w:r>
+        <w:rPr>
+          <w:i/>
+        </w:rPr>
+        <w:t>Polarization Index ($PI_c$)</w:t>
+      </w:r>
+      <w:r>
+        <w:t>: A composite index combining pronoun ratios with community-level mean toxicity:</w:t>
+      </w:r>
+    </w:p>
+    <w:p>
+      <w:pPr>
+        <w:spacing w:line="240" w:lineRule="auto" w:after="160" w:before="160"/>
+        <w:jc w:val="center"/>
+      </w:pPr>
+      <w:r>
+        <w:t>PI_c = R_{we\_them} \times \bar{T}_c</w:t>
+      </w:r>
+    </w:p>
+    <w:p>
+      <w:pPr>
+        <w:spacing w:line="240" w:lineRule="auto" w:after="120"/>
+        <w:ind w:left="576"/>
+      </w:pPr>
+      <w:r>
+        <w:rPr>
+          <w:b/>
+        </w:rPr>
+        <w:t xml:space="preserve">2.  </w:t>
+      </w:r>
+      <w:r/>
+      <w:r>
+        <w:rPr>
+          <w:b/>
+        </w:rPr>
+        <w:t>Multimodal Vision-Language Features</w:t>
+      </w:r>
+      <w:r>
+        <w:t>:</w:t>
+      </w:r>
+    </w:p>
+    <w:p>
+      <w:pPr>
+        <w:spacing w:line="240" w:lineRule="auto" w:after="120"/>
+        <w:ind w:left="576"/>
+      </w:pPr>
+      <w:r>
+        <w:rPr>
+          <w:b/>
+        </w:rPr>
+        <w:t xml:space="preserve">•  </w:t>
+      </w:r>
+      <w:r>
+        <w:t xml:space="preserve">  </w:t>
+      </w:r>
+      <w:r>
+        <w:rPr>
+          <w:i/>
+        </w:rPr>
+        <w:t>Image Width and Height</w:t>
+      </w:r>
+      <w:r>
+        <w:t>: Native dimensions of the extracted meme image files.</w:t>
+      </w:r>
+    </w:p>
+    <w:p>
+      <w:pPr>
+        <w:spacing w:line="240" w:lineRule="auto" w:after="120"/>
+        <w:ind w:left="576"/>
+      </w:pPr>
+      <w:r>
+        <w:rPr>
+          <w:b/>
+        </w:rPr>
+        <w:t xml:space="preserve">•  </w:t>
+      </w:r>
+      <w:r>
+        <w:t xml:space="preserve">  </w:t>
+      </w:r>
+      <w:r>
+        <w:rPr>
+          <w:i/>
+        </w:rPr>
+        <w:t>Image and Text Embeddings</w:t>
+      </w:r>
+      <w:r>
+        <w:t>: High-dimensional vector representations (</w:t>
       </w:r>
       <w:r>
         <w:rPr>
@@ -622,7 +1004,7 @@
         <w:t>\vec{v}_i</w:t>
       </w:r>
       <w:r>
-        <w:t xml:space="preserve"> and text vector </w:t>
+        <w:t xml:space="preserve"> and </w:t>
       </w:r>
       <w:r>
         <w:rPr>
@@ -633,30 +1015,23 @@
         <w:t>\vec{v}_t</w:t>
       </w:r>
       <w:r>
-        <w:t>:</w:t>
+        <w:t xml:space="preserve"> in </w:t>
+      </w:r>
+      <w:r>
+        <w:rPr>
+          <w:rFonts w:ascii="Consolas" w:hAnsi="Consolas"/>
+          <w:color w:val="781414"/>
+          <w:sz w:val="20"/>
+        </w:rPr>
+        <w:t>\mathbb{R}^{512}</w:t>
+      </w:r>
+      <w:r>
+        <w:t>) extracted from OpenAI's CLIP model.</w:t>
       </w:r>
     </w:p>
     <w:p>
       <w:pPr>
-        <w:spacing w:line="276" w:lineRule="auto" w:after="160" w:before="160"/>
-        <w:jc w:val="center"/>
-      </w:pPr>
-      <w:r>
-        <w:t>\text{Similarity}(\vec{v}_i, \vec{v}_t) = \frac{\vec{v}_i \cdot \vec{v}_t}{\|\vec{v}_i\| \|\vec{v}_t\|}</w:t>
-      </w:r>
-    </w:p>
-    <w:p>
-      <w:pPr>
-        <w:spacing w:line="276" w:lineRule="auto" w:after="120"/>
-        <w:jc w:val="both"/>
-      </w:pPr>
-      <w:r>
-        <w:t>Furthermore, we utilize CLIP's zero-shot classification capabilities to categorize the visual content of memes into three distinct rhetorical labels:</w:t>
-      </w:r>
-    </w:p>
-    <w:p>
-      <w:pPr>
-        <w:spacing w:line="276" w:lineRule="auto" w:after="120"/>
+        <w:spacing w:line="240" w:lineRule="auto" w:after="120"/>
         <w:ind w:left="576"/>
       </w:pPr>
       <w:r>
@@ -666,12 +1041,30 @@
         <w:t xml:space="preserve">•  </w:t>
       </w:r>
       <w:r>
-        <w:t xml:space="preserve">  `"a meme about us (in-group)"` (representing in-group reinforcement or self-referential imagery).</w:t>
+        <w:t xml:space="preserve">  </w:t>
+      </w:r>
+      <w:r>
+        <w:rPr>
+          <w:i/>
+        </w:rPr>
+        <w:t>Meme Cosine Similarity</w:t>
+      </w:r>
+      <w:r>
+        <w:t>: The dot product of the normalized image and text embedding vectors, reflecting visual-textual semantic alignment:</w:t>
       </w:r>
     </w:p>
     <w:p>
       <w:pPr>
-        <w:spacing w:line="276" w:lineRule="auto" w:after="120"/>
+        <w:spacing w:line="240" w:lineRule="auto" w:after="160" w:before="160"/>
+        <w:jc w:val="center"/>
+      </w:pPr>
+      <w:r>
+        <w:t>\text{Similarity}(\vec{v}_i, \vec{v}_t) = \frac{\vec{v}_i \cdot \vec{v}_t}{\|\vec{v}_i\| \|\vec{v}_t\|}</w:t>
+      </w:r>
+    </w:p>
+    <w:p>
+      <w:pPr>
+        <w:spacing w:line="240" w:lineRule="auto" w:after="120"/>
         <w:ind w:left="576"/>
       </w:pPr>
       <w:r>
@@ -681,12 +1074,43 @@
         <w:t xml:space="preserve">•  </w:t>
       </w:r>
       <w:r>
-        <w:t xml:space="preserve">  `"a meme about them (out-group)"` (representing out-group opposition or attack vectors).</w:t>
+        <w:t xml:space="preserve">  </w:t>
+      </w:r>
+      <w:r>
+        <w:rPr>
+          <w:i/>
+        </w:rPr>
+        <w:t>Zero-Shot Logits and Probabilities</w:t>
+      </w:r>
+      <w:r>
+        <w:t>: Class probabilities computed across three rhetorical target labels: `"a meme about us (in-group)"`, `"a meme about them (out-group)"`, and `"a neutral image"`.</w:t>
       </w:r>
     </w:p>
     <w:p>
       <w:pPr>
-        <w:spacing w:line="276" w:lineRule="auto" w:after="120"/>
+        <w:spacing w:line="240" w:lineRule="auto" w:after="120"/>
+        <w:ind w:left="576"/>
+      </w:pPr>
+      <w:r>
+        <w:rPr>
+          <w:b/>
+        </w:rPr>
+        <w:t xml:space="preserve">3.  </w:t>
+      </w:r>
+      <w:r/>
+      <w:r>
+        <w:rPr>
+          <w:b/>
+        </w:rPr>
+        <w:t>Network and SNA Features</w:t>
+      </w:r>
+      <w:r>
+        <w:t>:</w:t>
+      </w:r>
+    </w:p>
+    <w:p>
+      <w:pPr>
+        <w:spacing w:line="240" w:lineRule="auto" w:after="120"/>
         <w:ind w:left="576"/>
       </w:pPr>
       <w:r>
@@ -696,34 +1120,112 @@
         <w:t xml:space="preserve">•  </w:t>
       </w:r>
       <w:r>
-        <w:t xml:space="preserve">  `"a neutral image"` (representing standard, non-rhetorical visual layouts).</w:t>
+        <w:t xml:space="preserve">  </w:t>
+      </w:r>
+      <w:r>
+        <w:rPr>
+          <w:i/>
+        </w:rPr>
+        <w:t>Node ID</w:t>
+      </w:r>
+      <w:r>
+        <w:t>: Standardized identifier (e.g., `yt_user_X`, `tw_tweet_Y`, `ig_comment_Z`).</w:t>
       </w:r>
     </w:p>
     <w:p>
       <w:pPr>
-        <w:spacing w:line="276" w:lineRule="auto" w:after="120"/>
-        <w:jc w:val="both"/>
+        <w:spacing w:line="240" w:lineRule="auto" w:after="120"/>
+        <w:ind w:left="576"/>
       </w:pPr>
-      <w:r>
-        <w:t xml:space="preserve">The local execution automatically detects and exploits hardware acceleration, routing calculations through Apple Silicon </w:t>
-      </w:r>
       <w:r>
         <w:rPr>
           <w:b/>
         </w:rPr>
-        <w:t>MPS</w:t>
-      </w:r>
-      <w:r>
-        <w:t xml:space="preserve"> (Metal Performance Shaders) or NVIDIA </w:t>
-      </w:r>
+        <w:t xml:space="preserve">•  </w:t>
+      </w:r>
+      <w:r>
+        <w:t xml:space="preserve">  </w:t>
+      </w:r>
+      <w:r>
+        <w:rPr>
+          <w:i/>
+        </w:rPr>
+        <w:t>Node Type</w:t>
+      </w:r>
+      <w:r>
+        <w:t>: Categorical attribute specifying whether a node represents a user, a tweet, a comment, or a post.</w:t>
+      </w:r>
+    </w:p>
+    <w:p>
+      <w:pPr>
+        <w:spacing w:line="240" w:lineRule="auto" w:after="120"/>
+        <w:ind w:left="576"/>
+      </w:pPr>
       <w:r>
         <w:rPr>
           <w:b/>
         </w:rPr>
-        <w:t>CUDA</w:t>
-      </w:r>
-      <w:r>
-        <w:t xml:space="preserve"> to optimize processing times.</w:t>
+        <w:t xml:space="preserve">•  </w:t>
+      </w:r>
+      <w:r>
+        <w:t xml:space="preserve">  </w:t>
+      </w:r>
+      <w:r>
+        <w:rPr>
+          <w:i/>
+        </w:rPr>
+        <w:t>Edge Type</w:t>
+      </w:r>
+      <w:r>
+        <w:t>: Relation descriptor mapping interactions (replies, mentions, retweets).</w:t>
+      </w:r>
+    </w:p>
+    <w:p>
+      <w:pPr>
+        <w:spacing w:line="240" w:lineRule="auto" w:after="120"/>
+        <w:ind w:left="576"/>
+      </w:pPr>
+      <w:r>
+        <w:rPr>
+          <w:b/>
+        </w:rPr>
+        <w:t xml:space="preserve">•  </w:t>
+      </w:r>
+      <w:r>
+        <w:t xml:space="preserve">  </w:t>
+      </w:r>
+      <w:r>
+        <w:rPr>
+          <w:i/>
+        </w:rPr>
+        <w:t>Node Degree ($k_i$)</w:t>
+      </w:r>
+      <w:r>
+        <w:t>: Total incoming and outgoing connections representing individual user activity/influence.</w:t>
+      </w:r>
+    </w:p>
+    <w:p>
+      <w:pPr>
+        <w:spacing w:line="240" w:lineRule="auto" w:after="120"/>
+        <w:ind w:left="576"/>
+      </w:pPr>
+      <w:r>
+        <w:rPr>
+          <w:b/>
+        </w:rPr>
+        <w:t xml:space="preserve">•  </w:t>
+      </w:r>
+      <w:r>
+        <w:t xml:space="preserve">  </w:t>
+      </w:r>
+      <w:r>
+        <w:rPr>
+          <w:i/>
+        </w:rPr>
+        <w:t>Community Label ($c_i$)</w:t>
+      </w:r>
+      <w:r>
+        <w:t>: Numerical index mapping nodes to distinct echo chambers partitioned by the Louvain Modularity algorithm.</w:t>
       </w:r>
     </w:p>
     <w:p>
@@ -737,25 +1239,150 @@
           <w:color w:val="3B82F6"/>
           <w:sz w:val="24"/>
         </w:rPr>
-        <w:t>C. Cross-Platform Interaction Network Merge</w:t>
+        <w:t>D. Pipeline Implementation (2.3 Implementation)</w:t>
       </w:r>
     </w:p>
     <w:p>
       <w:pPr>
-        <w:spacing w:line="276" w:lineRule="auto" w:after="120"/>
+        <w:spacing w:line="240" w:lineRule="auto" w:after="120"/>
         <w:jc w:val="both"/>
       </w:pPr>
       <w:r>
-        <w:t xml:space="preserve">We construct a large-scale directed interaction network where nodes represent individual user accounts or posts, and directed edges represent physical interactions (replies, mentions, or retweets). To isolate dense, non-overlapping discussion communities (echo chambers), we apply the </w:t>
-      </w:r>
+        <w:t>The system is developed entirely in Python 3.10+ and comprises several specialized execution modules:</w:t>
+      </w:r>
+    </w:p>
+    <w:p>
+      <w:pPr>
+        <w:spacing w:line="240" w:lineRule="auto" w:after="120"/>
+        <w:ind w:left="576"/>
+      </w:pPr>
       <w:r>
         <w:rPr>
           <w:b/>
         </w:rPr>
-        <w:t>Louvain modularity maximization algorithm</w:t>
-      </w:r>
-      <w:r>
-        <w:t>. The modularity score (</w:t>
+        <w:t xml:space="preserve">1.  </w:t>
+      </w:r>
+      <w:r/>
+      <w:r>
+        <w:rPr>
+          <w:b/>
+        </w:rPr>
+        <w:t>Multimodal Execution &amp; Hardware Routing</w:t>
+      </w:r>
+      <w:r>
+        <w:t>: Local CLIP inference is powered by PyTorch and the Hugging Face `transformers` library. The script dynamically queries system capabilities and routes tensor computations to Apple Silicon GPUs via Metal Performance Shaders (</w:t>
+      </w:r>
+      <w:r>
+        <w:rPr>
+          <w:b/>
+        </w:rPr>
+        <w:t>MPS</w:t>
+      </w:r>
+      <w:r>
+        <w:t>), NVIDIA GPUs via CUDA, or falls back to CPU execution if no GPU is present. This hardware-agnostic routing guarantees optimal runtime performance.</w:t>
+      </w:r>
+    </w:p>
+    <w:p>
+      <w:pPr>
+        <w:spacing w:line="240" w:lineRule="auto" w:after="120"/>
+        <w:ind w:left="576"/>
+      </w:pPr>
+      <w:r>
+        <w:rPr>
+          <w:b/>
+        </w:rPr>
+        <w:t xml:space="preserve">2.  </w:t>
+      </w:r>
+      <w:r/>
+      <w:r>
+        <w:rPr>
+          <w:b/>
+        </w:rPr>
+        <w:t>Cross-Platform Graph Synthesis</w:t>
+      </w:r>
+      <w:r>
+        <w:t>: We use NetworkX to synthesize a directed network graph composed of platform-specific interaction structures.</w:t>
+      </w:r>
+    </w:p>
+    <w:p>
+      <w:pPr>
+        <w:spacing w:line="240" w:lineRule="auto" w:after="120"/>
+        <w:ind w:left="576"/>
+      </w:pPr>
+      <w:r>
+        <w:rPr>
+          <w:b/>
+        </w:rPr>
+        <w:t xml:space="preserve">•  </w:t>
+      </w:r>
+      <w:r>
+        <w:t xml:space="preserve">  </w:t>
+      </w:r>
+      <w:r>
+        <w:rPr>
+          <w:i/>
+        </w:rPr>
+        <w:t>YouTube</w:t>
+      </w:r>
+      <w:r>
+        <w:t>: Directed edge from user nodes to target video nodes based on comment logs.</w:t>
+      </w:r>
+    </w:p>
+    <w:p>
+      <w:pPr>
+        <w:spacing w:line="240" w:lineRule="auto" w:after="120"/>
+        <w:ind w:left="576"/>
+      </w:pPr>
+      <w:r>
+        <w:rPr>
+          <w:b/>
+        </w:rPr>
+        <w:t xml:space="preserve">•  </w:t>
+      </w:r>
+      <w:r>
+        <w:t xml:space="preserve">  </w:t>
+      </w:r>
+      <w:r>
+        <w:rPr>
+          <w:i/>
+        </w:rPr>
+        <w:t>Instagram</w:t>
+      </w:r>
+      <w:r>
+        <w:t>: Directed edges representing comment replies and user mentions extracted using regex email/mention patterns (`@\w+`).</w:t>
+      </w:r>
+    </w:p>
+    <w:p>
+      <w:pPr>
+        <w:spacing w:line="240" w:lineRule="auto" w:after="120"/>
+        <w:ind w:left="576"/>
+      </w:pPr>
+      <w:r>
+        <w:rPr>
+          <w:b/>
+        </w:rPr>
+        <w:t xml:space="preserve">•  </w:t>
+      </w:r>
+      <w:r>
+        <w:t xml:space="preserve">  </w:t>
+      </w:r>
+      <w:r>
+        <w:rPr>
+          <w:i/>
+        </w:rPr>
+        <w:t>Twitter</w:t>
+      </w:r>
+      <w:r>
+        <w:t>: Mentions mapped as directed edges from tweet author to mentioned user.</w:t>
+      </w:r>
+    </w:p>
+    <w:p>
+      <w:pPr>
+        <w:spacing w:line="240" w:lineRule="auto" w:after="120"/>
+        <w:jc w:val="both"/>
+      </w:pPr>
+      <w:r>
+        <w:t xml:space="preserve">The combined graph is converted to an undirected representation, isolated nodes (degree </w:t>
       </w:r>
       <w:r>
         <w:rPr>
@@ -763,343 +1390,54 @@
           <w:color w:val="781414"/>
           <w:sz w:val="20"/>
         </w:rPr>
-        <w:t>Q</w:t>
-      </w:r>
-      <w:r>
-        <w:t>) is mathematically defined as:</w:t>
+        <w:t>&lt; 3</w:t>
+      </w:r>
+      <w:r>
+        <w:t>) are pruned to reduce topological noise, and the Louvain community partitioning algorithm is executed. The resulting partitioned graph is exported in Graph Modeling Language (GML) format for analysis and visualization.</w:t>
       </w:r>
     </w:p>
     <w:p>
       <w:pPr>
-        <w:spacing w:line="276" w:lineRule="auto" w:after="160" w:before="160"/>
-        <w:jc w:val="center"/>
+        <w:spacing w:line="240" w:lineRule="auto" w:after="120"/>
+        <w:ind w:left="576"/>
       </w:pPr>
       <w:r>
-        <w:t>Q = \frac{1}{2m} \sum_{i,j} \left[ A_{ij} - \frac{k_i k_j}{2m} \right] \delta(c_i, c_j)</w:t>
+        <w:rPr>
+          <w:b/>
+        </w:rPr>
+        <w:t xml:space="preserve">3.  </w:t>
+      </w:r>
+      <w:r/>
+      <w:r>
+        <w:rPr>
+          <w:b/>
+        </w:rPr>
+        <w:t>API Integration and Throttling</w:t>
+      </w:r>
+      <w:r>
+        <w:t>: The NLP module interacts with Jigsaw's Perspective API via the `google-api-python-client` library. To prevent API rate limit failures (quota errors on the standard 1 QPS tier), the script implements a strict throttling wrapper, enforcing a 1.1-second sleep delay after each query.</w:t>
       </w:r>
     </w:p>
     <w:p>
       <w:pPr>
-        <w:spacing w:line="276" w:lineRule="auto" w:after="120"/>
-        <w:jc w:val="both"/>
+        <w:spacing w:line="240" w:lineRule="auto" w:after="120"/>
+        <w:ind w:left="576"/>
       </w:pPr>
-      <w:r>
-        <w:t xml:space="preserve">where </w:t>
-      </w:r>
-      <w:r>
-        <w:rPr>
-          <w:rFonts w:ascii="Consolas" w:hAnsi="Consolas"/>
-          <w:color w:val="781414"/>
-          <w:sz w:val="20"/>
-        </w:rPr>
-        <w:t>A_{ij}</w:t>
-      </w:r>
-      <w:r>
-        <w:t xml:space="preserve"> represents the adjacency matrix weight between nodes </w:t>
-      </w:r>
-      <w:r>
-        <w:rPr>
-          <w:rFonts w:ascii="Consolas" w:hAnsi="Consolas"/>
-          <w:color w:val="781414"/>
-          <w:sz w:val="20"/>
-        </w:rPr>
-        <w:t>i</w:t>
-      </w:r>
-      <w:r>
-        <w:t xml:space="preserve"> and </w:t>
-      </w:r>
-      <w:r>
-        <w:rPr>
-          <w:rFonts w:ascii="Consolas" w:hAnsi="Consolas"/>
-          <w:color w:val="781414"/>
-          <w:sz w:val="20"/>
-        </w:rPr>
-        <w:t>j</w:t>
-      </w:r>
-      <w:r>
-        <w:t xml:space="preserve">, </w:t>
-      </w:r>
-      <w:r>
-        <w:rPr>
-          <w:rFonts w:ascii="Consolas" w:hAnsi="Consolas"/>
-          <w:color w:val="781414"/>
-          <w:sz w:val="20"/>
-        </w:rPr>
-        <w:t>k_i</w:t>
-      </w:r>
-      <w:r>
-        <w:t xml:space="preserve"> and </w:t>
-      </w:r>
-      <w:r>
-        <w:rPr>
-          <w:rFonts w:ascii="Consolas" w:hAnsi="Consolas"/>
-          <w:color w:val="781414"/>
-          <w:sz w:val="20"/>
-        </w:rPr>
-        <w:t>k_j</w:t>
-      </w:r>
-      <w:r>
-        <w:t xml:space="preserve"> represent their respective node degrees, </w:t>
-      </w:r>
-      <w:r>
-        <w:rPr>
-          <w:rFonts w:ascii="Consolas" w:hAnsi="Consolas"/>
-          <w:color w:val="781414"/>
-          <w:sz w:val="20"/>
-        </w:rPr>
-        <w:t>m</w:t>
-      </w:r>
-      <w:r>
-        <w:t xml:space="preserve"> is the total sum of edge weights in the network, </w:t>
-      </w:r>
-      <w:r>
-        <w:rPr>
-          <w:rFonts w:ascii="Consolas" w:hAnsi="Consolas"/>
-          <w:color w:val="781414"/>
-          <w:sz w:val="20"/>
-        </w:rPr>
-        <w:t>c_i</w:t>
-      </w:r>
-      <w:r>
-        <w:t xml:space="preserve"> and </w:t>
-      </w:r>
-      <w:r>
-        <w:rPr>
-          <w:rFonts w:ascii="Consolas" w:hAnsi="Consolas"/>
-          <w:color w:val="781414"/>
-          <w:sz w:val="20"/>
-        </w:rPr>
-        <w:t>c_j</w:t>
-      </w:r>
-      <w:r>
-        <w:t xml:space="preserve"> indicate the communities to which the nodes belong, and </w:t>
-      </w:r>
-      <w:r>
-        <w:rPr>
-          <w:rFonts w:ascii="Consolas" w:hAnsi="Consolas"/>
-          <w:color w:val="781414"/>
-          <w:sz w:val="20"/>
-        </w:rPr>
-        <w:t>\delta(c_i, c_j)</w:t>
-      </w:r>
-      <w:r>
-        <w:t xml:space="preserve"> is the Kronecker delta function (returning 1 if </w:t>
-      </w:r>
-      <w:r>
-        <w:rPr>
-          <w:rFonts w:ascii="Consolas" w:hAnsi="Consolas"/>
-          <w:color w:val="781414"/>
-          <w:sz w:val="20"/>
-        </w:rPr>
-        <w:t>c_i = c_j</w:t>
-      </w:r>
-      <w:r>
-        <w:t>, and 0 otherwise).</w:t>
-      </w:r>
-    </w:p>
-    <w:p>
-      <w:pPr>
-        <w:spacing w:before="240" w:after="120"/>
-      </w:pPr>
-      <w:r>
-        <w:rPr>
-          <w:rFonts w:ascii="Calibri" w:hAnsi="Calibri"/>
-          <w:b/>
-          <w:color w:val="3B82F6"/>
-          <w:sz w:val="24"/>
-        </w:rPr>
-        <w:t>D. Linguistic Polarization Index</w:t>
-      </w:r>
-    </w:p>
-    <w:p>
-      <w:pPr>
-        <w:spacing w:line="276" w:lineRule="auto" w:after="120"/>
-        <w:jc w:val="both"/>
-      </w:pPr>
-      <w:r>
-        <w:t xml:space="preserve">For each community </w:t>
-      </w:r>
-      <w:r>
-        <w:rPr>
-          <w:rFonts w:ascii="Consolas" w:hAnsi="Consolas"/>
-          <w:color w:val="781414"/>
-          <w:sz w:val="20"/>
-        </w:rPr>
-        <w:t>c</w:t>
-      </w:r>
-      <w:r>
-        <w:t xml:space="preserve"> extracted by the Louvain algorithm, we compute a composite metric designated as the </w:t>
-      </w:r>
       <w:r>
         <w:rPr>
           <w:b/>
         </w:rPr>
-        <w:t>Polarization Index</w:t>
-      </w:r>
-      <w:r>
-        <w:t xml:space="preserve"> (</w:t>
-      </w:r>
-      <w:r>
-        <w:rPr>
-          <w:rFonts w:ascii="Consolas" w:hAnsi="Consolas"/>
-          <w:color w:val="781414"/>
-          <w:sz w:val="20"/>
-        </w:rPr>
-        <w:t>PI_c</w:t>
-      </w:r>
-      <w:r>
-        <w:t>). This index quantifies the intersection of linguistic tribalism with overall conversational toxicity.</w:t>
-      </w:r>
-    </w:p>
-    <w:p>
-      <w:pPr>
-        <w:spacing w:line="276" w:lineRule="auto" w:after="120"/>
-        <w:jc w:val="both"/>
-      </w:pPr>
-      <w:r>
-        <w:t xml:space="preserve">First, we measure tribalism by extracting the </w:t>
-      </w:r>
+        <w:t xml:space="preserve">4.  </w:t>
+      </w:r>
+      <w:r/>
       <w:r>
         <w:rPr>
           <w:b/>
         </w:rPr>
-        <w:t>We/Them Ratio</w:t>
-      </w:r>
-      <w:r>
-        <w:t xml:space="preserve"> (</w:t>
-      </w:r>
-      <w:r>
-        <w:rPr>
-          <w:rFonts w:ascii="Consolas" w:hAnsi="Consolas"/>
-          <w:color w:val="781414"/>
-          <w:sz w:val="20"/>
-        </w:rPr>
-        <w:t>R_{we\_them}</w:t>
-      </w:r>
-      <w:r>
-        <w:t>). We define the respective pronoun lexicons as:</w:t>
-      </w:r>
-    </w:p>
-    <w:p>
-      <w:pPr>
-        <w:spacing w:line="276" w:lineRule="auto" w:after="120"/>
-        <w:ind w:left="576"/>
-      </w:pPr>
-      <w:r>
-        <w:rPr>
-          <w:b/>
-        </w:rPr>
-        <w:t xml:space="preserve">•  </w:t>
-      </w:r>
-      <w:r>
-        <w:t xml:space="preserve">  </w:t>
-      </w:r>
-      <w:r>
-        <w:rPr>
-          <w:rFonts w:ascii="Consolas" w:hAnsi="Consolas"/>
-          <w:color w:val="781414"/>
-          <w:sz w:val="20"/>
-        </w:rPr>
-        <w:t>\text{We} = \{\text{we, us, our, ours, ourselves}\}</w:t>
-      </w:r>
-      <w:r/>
-    </w:p>
-    <w:p>
-      <w:pPr>
-        <w:spacing w:line="276" w:lineRule="auto" w:after="120"/>
-        <w:ind w:left="576"/>
-      </w:pPr>
-      <w:r>
-        <w:rPr>
-          <w:b/>
-        </w:rPr>
-        <w:t xml:space="preserve">•  </w:t>
-      </w:r>
-      <w:r>
-        <w:t xml:space="preserve">  </w:t>
-      </w:r>
-      <w:r>
-        <w:rPr>
-          <w:rFonts w:ascii="Consolas" w:hAnsi="Consolas"/>
-          <w:color w:val="781414"/>
-          <w:sz w:val="20"/>
-        </w:rPr>
-        <w:t>\text{Them} = \{\text{they, them, their, theirs, themselves}\}</w:t>
-      </w:r>
-      <w:r/>
-    </w:p>
-    <w:p>
-      <w:pPr>
-        <w:spacing w:line="276" w:lineRule="auto" w:after="160" w:before="160"/>
-        <w:jc w:val="center"/>
-      </w:pPr>
-      <w:r>
-        <w:t>R_{we\_them} = \frac{\text{Count}(\text{We})}{\max(1, \text{Count}(\text{Them}))}</w:t>
-      </w:r>
-    </w:p>
-    <w:p>
-      <w:pPr>
-        <w:spacing w:line="276" w:lineRule="auto" w:after="120"/>
-        <w:jc w:val="both"/>
-      </w:pPr>
-      <w:r>
-        <w:t xml:space="preserve">A ratio greater than </w:t>
-      </w:r>
-      <w:r>
-        <w:rPr>
-          <w:rFonts w:ascii="Consolas" w:hAnsi="Consolas"/>
-          <w:color w:val="781414"/>
-          <w:sz w:val="20"/>
-        </w:rPr>
-        <w:t>1.0</w:t>
-      </w:r>
-      <w:r>
-        <w:t xml:space="preserve"> indicates that the community's discourse is predominantly self-referential or focused on in-group identity. Finally, we formulate the Polarization Index (</w:t>
-      </w:r>
-      <w:r>
-        <w:rPr>
-          <w:rFonts w:ascii="Consolas" w:hAnsi="Consolas"/>
-          <w:color w:val="781414"/>
-          <w:sz w:val="20"/>
-        </w:rPr>
-        <w:t>PI_c</w:t>
-      </w:r>
-      <w:r>
-        <w:t>) as:</w:t>
-      </w:r>
-    </w:p>
-    <w:p>
-      <w:pPr>
-        <w:spacing w:line="276" w:lineRule="auto" w:after="160" w:before="160"/>
-        <w:jc w:val="center"/>
-      </w:pPr>
-      <w:r>
-        <w:t>PI_c = R_{we\_them} \times \bar{T}_c</w:t>
-      </w:r>
-    </w:p>
-    <w:p>
-      <w:pPr>
-        <w:spacing w:line="276" w:lineRule="auto" w:after="120"/>
-        <w:jc w:val="both"/>
-      </w:pPr>
-      <w:r>
-        <w:t xml:space="preserve">where </w:t>
-      </w:r>
-      <w:r>
-        <w:rPr>
-          <w:rFonts w:ascii="Consolas" w:hAnsi="Consolas"/>
-          <w:color w:val="781414"/>
-          <w:sz w:val="20"/>
-        </w:rPr>
-        <w:t>\bar{T}_c</w:t>
-      </w:r>
-      <w:r>
-        <w:t xml:space="preserve"> is the mean contextual toxicity probability of the community's text, queried from the Google Perspective API.</w:t>
-      </w:r>
-    </w:p>
-    <w:p>
-      <w:r>
-        <w:br w:type="page"/>
+        <w:t>Scientific Visualization Dashboard</w:t>
+      </w:r>
+      <w:r>
+        <w:t>: The user interface is built using Streamlit. To ensure responsive network visualization, we bypass the browser DOM bottlenecks of SVG objects by implementing Plotly WebGL (`go.Scattergl`) to render the 20,641-node network graph. All database queries, centrality computations, and layout configurations are cached via the `@st.cache_data` decorator, preventing interface reload lag during user filtering.</w:t>
       </w:r>
     </w:p>
     <w:p>
@@ -1113,7 +1451,16 @@
           <w:color w:val="3B82F6"/>
           <w:sz w:val="28"/>
         </w:rPr>
-        <w:t>IV. EXPERIMENTAL SETUP &amp; QUANTITATIVE RESULTS</w:t>
+        <w:t>III. RESULTS AND DISCUSSION</w:t>
+      </w:r>
+    </w:p>
+    <w:p>
+      <w:pPr>
+        <w:spacing w:line="240" w:lineRule="auto" w:after="120"/>
+        <w:jc w:val="both"/>
+      </w:pPr>
+      <w:r>
+        <w:t>In this section, we present the empirical results obtained from our pipeline execution across the baseline, multimodal, network, and linguistic analysis phases. We discuss these outcomes in the context of computational social science and outline the technical challenges resolved during implementation.</w:t>
       </w:r>
     </w:p>
     <w:p>
@@ -1132,43 +1479,45 @@
     </w:p>
     <w:p>
       <w:pPr>
-        <w:spacing w:line="276" w:lineRule="auto" w:after="120"/>
+        <w:spacing w:line="240" w:lineRule="auto" w:after="120"/>
         <w:jc w:val="both"/>
       </w:pPr>
       <w:r>
-        <w:t xml:space="preserve">To validate the necessity of advanced deep learning architectures, we established an initial baseline in the early evaluation phase using a naive negativity keyword dictionary (counting negative words such as </w:t>
+        <w:t xml:space="preserve">To establish a baseline and justify the integration of deep learning networks, we analyzed the correlation between primitive lexicon-based negativity and user engagement metrics. The negativity score was calculated by counting occurrences of basic hostile terms (e.g., </w:t>
       </w:r>
       <w:r>
         <w:rPr>
           <w:i/>
         </w:rPr>
-        <w:t>bad, fake, hate, stupid, idiot</w:t>
-      </w:r>
-      <w:r>
-        <w:t xml:space="preserve">). We evaluated the correlation between this lexicon-derived negativity score and user engagement metrics (Reddit score and comment counts; YouTube like counts) using the </w:t>
-      </w:r>
-      <w:r>
-        <w:rPr>
-          <w:b/>
-        </w:rPr>
-        <w:t>Spearman Rank Correlation</w:t>
-      </w:r>
-      <w:r>
-        <w:t>.</w:t>
+        <w:t>bad, hate, stupid, idiot, fake</w:t>
+      </w:r>
+      <w:r>
+        <w:t>) within comments. Engagement was modeled as the sum of score and comment counts for Reddit, and like counts for YouTube.</w:t>
       </w:r>
     </w:p>
     <w:p>
       <w:pPr>
-        <w:spacing w:line="276" w:lineRule="auto" w:after="120"/>
+        <w:spacing w:line="240" w:lineRule="auto" w:after="120"/>
         <w:jc w:val="both"/>
       </w:pPr>
       <w:r>
-        <w:t>The experimental results yielded:</w:t>
+        <w:t>The Spearman Rank Correlation (</w:t>
+      </w:r>
+      <w:r>
+        <w:rPr>
+          <w:rFonts w:ascii="Consolas" w:hAnsi="Consolas"/>
+          <w:color w:val="781414"/>
+          <w:sz w:val="20"/>
+        </w:rPr>
+        <w:t>\rho</w:t>
+      </w:r>
+      <w:r>
+        <w:t>) yielded the following values:</w:t>
       </w:r>
     </w:p>
     <w:p>
       <w:pPr>
-        <w:spacing w:line="276" w:lineRule="auto" w:after="120"/>
+        <w:spacing w:line="240" w:lineRule="auto" w:after="120"/>
         <w:ind w:left="576"/>
       </w:pPr>
       <w:r>
@@ -1184,7 +1533,7 @@
         <w:rPr>
           <w:b/>
         </w:rPr>
-        <w:t>Reddit political dataset</w:t>
+        <w:t>Reddit political posts</w:t>
       </w:r>
       <w:r>
         <w:t xml:space="preserve">: </w:t>
@@ -1198,7 +1547,7 @@
         <w:t>\rho = 0.0148</w:t>
       </w:r>
       <w:r>
-        <w:t xml:space="preserve">, </w:t>
+        <w:t xml:space="preserve"> (</w:t>
       </w:r>
       <w:r>
         <w:rPr>
@@ -1209,12 +1558,12 @@
         <w:t>p = 0.2246</w:t>
       </w:r>
       <w:r>
-        <w:t>.</w:t>
+        <w:t>).</w:t>
       </w:r>
     </w:p>
     <w:p>
       <w:pPr>
-        <w:spacing w:line="276" w:lineRule="auto" w:after="120"/>
+        <w:spacing w:line="240" w:lineRule="auto" w:after="120"/>
         <w:ind w:left="576"/>
       </w:pPr>
       <w:r>
@@ -1230,7 +1579,7 @@
         <w:rPr>
           <w:b/>
         </w:rPr>
-        <w:t>YouTube political comments</w:t>
+        <w:t>YouTube comments</w:t>
       </w:r>
       <w:r>
         <w:t xml:space="preserve">: </w:t>
@@ -1244,7 +1593,7 @@
         <w:t>\rho = 0.0050</w:t>
       </w:r>
       <w:r>
-        <w:t xml:space="preserve">, </w:t>
+        <w:t xml:space="preserve"> (</w:t>
       </w:r>
       <w:r>
         <w:rPr>
@@ -1255,27 +1604,16 @@
         <w:t>p = 0.6326</w:t>
       </w:r>
       <w:r>
-        <w:t>.</w:t>
+        <w:t>).</w:t>
       </w:r>
     </w:p>
     <w:p>
       <w:pPr>
-        <w:spacing w:line="276" w:lineRule="auto" w:after="120"/>
+        <w:spacing w:line="240" w:lineRule="auto" w:after="120"/>
         <w:jc w:val="both"/>
       </w:pPr>
       <w:r>
-        <w:t>The correlation coefficients (</w:t>
-      </w:r>
-      <w:r>
-        <w:rPr>
-          <w:rFonts w:ascii="Consolas" w:hAnsi="Consolas"/>
-          <w:color w:val="781414"/>
-          <w:sz w:val="20"/>
-        </w:rPr>
-        <w:t>\rho</w:t>
-      </w:r>
-      <w:r>
-        <w:t>) are statistically equivalent to zero, and the high p-values (</w:t>
+        <w:t>The correlation coefficients are statistically indistinguishable from zero, and the high p-values (</w:t>
       </w:r>
       <w:r>
         <w:rPr>
@@ -1286,7 +1624,7 @@
         <w:t>p &gt; 0.05</w:t>
       </w:r>
       <w:r>
-        <w:t>) indicate statistical insignificance. This baseline experiment empirically demonstrated the failure of basic keyword matching to model online communication dynamics. It proved that simply counting hostile words ignores the sémantics of political debates, justifying our transition to deep contextual transformer APIs and multimodal embeddings.</w:t>
+        <w:t>) indicate that there is no statistically significant monotonic relationship between basic negative word count and engagement. This baseline result provides empirical evidence that counting hostile words is insufficient to capture political discussions on social media. Simple lexical matching is blind to sarcasm, rhetorical context, or political dog-whistles, thereby validating the necessity of deep contextual transformers and multimodal embedding spaces.</w:t>
       </w:r>
     </w:p>
     <w:p>
@@ -1305,11 +1643,97 @@
     </w:p>
     <w:p>
       <w:pPr>
-        <w:spacing w:line="276" w:lineRule="auto" w:after="120"/>
+        <w:spacing w:line="240" w:lineRule="auto" w:after="120"/>
         <w:jc w:val="both"/>
       </w:pPr>
       <w:r>
-        <w:t xml:space="preserve">Using the CLIP zero-shot pipeline on our political meme benchmark dataset, we analyzed visual/textual pairings. While standard text cleaning isolated the literal words, the zero-shot image classification revealed that memes featuring low image-text cosine similarity (often averaging </w:t>
+        <w:t xml:space="preserve">Using our local CLIP model on the Hateful Memes dataset, we analyzed the visual-textual dynamics of 2,000 political memes. By computing the cosine similarity between the visual embedding </w:t>
+      </w:r>
+      <w:r>
+        <w:rPr>
+          <w:rFonts w:ascii="Consolas" w:hAnsi="Consolas"/>
+          <w:color w:val="781414"/>
+          <w:sz w:val="20"/>
+        </w:rPr>
+        <w:t>\vec{v}_i</w:t>
+      </w:r>
+      <w:r>
+        <w:t xml:space="preserve"> and the textual embedding </w:t>
+      </w:r>
+      <w:r>
+        <w:rPr>
+          <w:rFonts w:ascii="Consolas" w:hAnsi="Consolas"/>
+          <w:color w:val="781414"/>
+          <w:sz w:val="20"/>
+        </w:rPr>
+        <w:t>\vec{v}_t</w:t>
+      </w:r>
+      <w:r>
+        <w:t>, we measured semantic alignment. Additionally, we executed zero-shot classification to map images to three classes: `"a meme about us (in-group)"`, `"a meme about them (out-group)"`, and `"a neutral image"`.</w:t>
+      </w:r>
+    </w:p>
+    <w:p>
+      <w:pPr>
+        <w:spacing w:line="240" w:lineRule="auto" w:after="120"/>
+        <w:jc w:val="both"/>
+      </w:pPr>
+      <w:r>
+        <w:t>The results are illustrated in the plots below:</w:t>
+      </w:r>
+    </w:p>
+    <w:p>
+      <w:pPr>
+        <w:spacing w:line="240" w:lineRule="auto" w:after="120"/>
+        <w:jc w:val="both"/>
+      </w:pPr>
+      <w:r>
+        <w:t>![Meme Label Distributions](figures/visual_predictions_distribution.png)</w:t>
+      </w:r>
+    </w:p>
+    <w:p>
+      <w:pPr>
+        <w:spacing w:line="240" w:lineRule="auto" w:after="120"/>
+        <w:jc w:val="both"/>
+      </w:pPr>
+      <w:r/>
+      <w:r>
+        <w:rPr>
+          <w:i/>
+        </w:rPr>
+        <w:t>Figure 1: Distribution of zero-shot visual labels assigned by the CLIP model across political memes.</w:t>
+      </w:r>
+      <w:r/>
+    </w:p>
+    <w:p>
+      <w:pPr>
+        <w:spacing w:line="240" w:lineRule="auto" w:after="120"/>
+        <w:jc w:val="both"/>
+      </w:pPr>
+      <w:r>
+        <w:t>![Meme Cosine Similarities by Label](figures/cosine_similarity_by_label.png)</w:t>
+      </w:r>
+    </w:p>
+    <w:p>
+      <w:pPr>
+        <w:spacing w:line="240" w:lineRule="auto" w:after="120"/>
+        <w:jc w:val="both"/>
+      </w:pPr>
+      <w:r/>
+      <w:r>
+        <w:rPr>
+          <w:i/>
+        </w:rPr>
+        <w:t>Figure 2: Text/Image cosine similarity scores categorized by the assigned zero-shot rhetorical label.</w:t>
+      </w:r>
+      <w:r/>
+    </w:p>
+    <w:p>
+      <w:pPr>
+        <w:spacing w:line="240" w:lineRule="auto" w:after="120"/>
+        <w:jc w:val="both"/>
+      </w:pPr>
+      <w:r>
+        <w:t xml:space="preserve">Our analysis revealed a significant finding: memes that exhibited a low image-text cosine similarity (averaging between </w:t>
       </w:r>
       <w:r>
         <w:rPr>
@@ -1320,7 +1744,7 @@
         <w:t>0.18</w:t>
       </w:r>
       <w:r>
-        <w:t xml:space="preserve"> to </w:t>
+        <w:t xml:space="preserve"> and </w:t>
       </w:r>
       <w:r>
         <w:rPr>
@@ -1331,16 +1755,7 @@
         <w:t>0.22</w:t>
       </w:r>
       <w:r>
-        <w:t>, which would traditionally indicate mismatched data) were actually highly polarized.</w:t>
-      </w:r>
-    </w:p>
-    <w:p>
-      <w:pPr>
-        <w:spacing w:line="276" w:lineRule="auto" w:after="120"/>
-        <w:jc w:val="both"/>
-      </w:pPr>
-      <w:r>
-        <w:t xml:space="preserve">Specifically, </w:t>
+        <w:t xml:space="preserve">, which in traditional text-image matching would indicate unrelated noise) were highly partisan. Specifically, </w:t>
       </w:r>
       <w:r>
         <w:rPr>
@@ -1351,7 +1766,7 @@
         <w:t>58\%</w:t>
       </w:r>
       <w:r>
-        <w:t xml:space="preserve"> of these low-similarity memes were classified as `"a meme about them (out-group)"`, indicating that the pairing of a benign, humorous image with a hostile text overlay is a primary rhetorical vector used to disseminate political hostility.</w:t>
+        <w:t xml:space="preserve"> of these low-similarity memes were classified as `"a meme about them (out-group)"`. This indicates that the rhetorical strategy of political memes frequently relies on pairing a benign, humorous, or unrelated image with a highly hostile or sarcastic text overlay to propagate out-group hostility. Relying solely on image-text alignment thresholds would fail to detect this form of polarization, highlighting the importance of joint zero-shot classification.</w:t>
       </w:r>
     </w:p>
     <w:p>
@@ -1370,16 +1785,16 @@
     </w:p>
     <w:p>
       <w:pPr>
-        <w:spacing w:line="276" w:lineRule="auto" w:after="120"/>
+        <w:spacing w:line="240" w:lineRule="auto" w:after="120"/>
         <w:jc w:val="both"/>
       </w:pPr>
       <w:r>
-        <w:t>During the network synthesis stage, we merged the interaction logs of Reddit, YouTube, Twitter, and Instagram into a single directed graph. After filtering out structural noise (removing isolated nodes with a degree of less than 3 to focus on core behaviors), we obtained the following network statistics:</w:t>
+        <w:t>By merging interaction structures from YouTube, Instagram, and Twitter, we constructed a unified directed network. After pruning isolated nodes with a degree less than 3, the final graph yielded the following topological metrics:</w:t>
       </w:r>
     </w:p>
     <w:p>
       <w:pPr>
-        <w:spacing w:line="276" w:lineRule="auto" w:after="120"/>
+        <w:spacing w:line="240" w:lineRule="auto" w:after="120"/>
         <w:ind w:left="576"/>
       </w:pPr>
       <w:r>
@@ -1398,12 +1813,12 @@
         <w:t>Total Nodes</w:t>
       </w:r>
       <w:r>
-        <w:t>: 20,641 (representing active cross-platform users and posts).</w:t>
+        <w:t>: 20,641 (active users and posts).</w:t>
       </w:r>
     </w:p>
     <w:p>
       <w:pPr>
-        <w:spacing w:line="276" w:lineRule="auto" w:after="120"/>
+        <w:spacing w:line="240" w:lineRule="auto" w:after="120"/>
         <w:ind w:left="576"/>
       </w:pPr>
       <w:r>
@@ -1427,7 +1842,7 @@
     </w:p>
     <w:p>
       <w:pPr>
-        <w:spacing w:line="276" w:lineRule="auto" w:after="120"/>
+        <w:spacing w:line="240" w:lineRule="auto" w:after="120"/>
         <w:ind w:left="576"/>
       </w:pPr>
       <w:r>
@@ -1443,15 +1858,15 @@
         <w:rPr>
           <w:b/>
         </w:rPr>
-        <w:t>Detected Communities</w:t>
-      </w:r>
-      <w:r>
-        <w:t>: 3,484.</w:t>
+        <w:t>Identified Communities</w:t>
+      </w:r>
+      <w:r>
+        <w:t>: 3,484 clusters.</w:t>
       </w:r>
     </w:p>
     <w:p>
       <w:pPr>
-        <w:spacing w:line="276" w:lineRule="auto" w:after="120"/>
+        <w:spacing w:line="240" w:lineRule="auto" w:after="120"/>
         <w:ind w:left="576"/>
       </w:pPr>
       <w:r>
@@ -1484,11 +1899,22 @@
     </w:p>
     <w:p>
       <w:pPr>
-        <w:spacing w:line="276" w:lineRule="auto" w:after="120"/>
+        <w:spacing w:line="240" w:lineRule="auto" w:after="120"/>
         <w:jc w:val="both"/>
       </w:pPr>
       <w:r>
-        <w:t xml:space="preserve">A modularity score above 0.3 indicates strong community divisions. Our modularity score of </w:t>
+        <w:t xml:space="preserve">A modularity score </w:t>
+      </w:r>
+      <w:r>
+        <w:rPr>
+          <w:rFonts w:ascii="Consolas" w:hAnsi="Consolas"/>
+          <w:color w:val="781414"/>
+          <w:sz w:val="20"/>
+        </w:rPr>
+        <w:t>Q &gt; 0.3</w:t>
+      </w:r>
+      <w:r>
+        <w:t xml:space="preserve"> indicates a strong community structure. A modularity score of </w:t>
       </w:r>
       <w:r>
         <w:rPr>
@@ -1497,7 +1923,7 @@
         <w:t>0.9539</w:t>
       </w:r>
       <w:r>
-        <w:t xml:space="preserve"> represents an extremely high degree of network segmentation. It provides mathematical proof that social media discourse is structured into highly insular echo chambers, with dense communication within clusters but nearly zero interaction across different ideological modules.</w:t>
+        <w:t xml:space="preserve"> represents an extremely high degree of network segmentation. This provides mathematical validation that online political discussion is structured into highly insular echo chambers. Users within a given Louvain partition communicate almost exclusively with each other, while interactions crossing different ideological modules are virtually non-existent.</w:t>
       </w:r>
     </w:p>
     <w:p>
@@ -1516,11 +1942,11 @@
     </w:p>
     <w:p>
       <w:pPr>
-        <w:spacing w:line="276" w:lineRule="auto" w:after="120"/>
+        <w:spacing w:line="240" w:lineRule="auto" w:after="120"/>
         <w:jc w:val="both"/>
       </w:pPr>
       <w:r>
-        <w:t>In the subsequent linguistic assessment phase, we sampled the text corpora of the top ten largest communities and queried the Google Perspective API to compute their respective Polarization Indices (</w:t>
+        <w:t>We sampled the text corpora of the top nine largest communities and queried the Google Perspective API to calculate the average community toxicity and the We/Them Ratio, resulting in the composite Polarization Index (</w:t>
       </w:r>
       <w:r>
         <w:rPr>
@@ -1531,7 +1957,7 @@
         <w:t>PI_c</w:t>
       </w:r>
       <w:r>
-        <w:t>). The quantitative results are summarized in the table below:</w:t>
+        <w:t>). The results are detailed in the table below:</w:t>
       </w:r>
     </w:p>
     <w:tbl>
@@ -2536,11 +2962,11 @@
     </w:p>
     <w:p>
       <w:pPr>
-        <w:spacing w:line="276" w:lineRule="auto" w:after="120"/>
+        <w:spacing w:line="240" w:lineRule="auto" w:after="120"/>
         <w:jc w:val="both"/>
       </w:pPr>
       <w:r>
-        <w:t xml:space="preserve">These results establish that highly partisan communities (such as Cluster 1 and Cluster 3) exhibit a We/Them ratio equal to or greater than </w:t>
+        <w:t xml:space="preserve">These results establish that highly partisan groups (e.g., Cluster 1 and Cluster 3) exhibit a We/Them ratio </w:t>
       </w:r>
       <w:r>
         <w:rPr>
@@ -2548,10 +2974,10 @@
           <w:color w:val="781414"/>
           <w:sz w:val="20"/>
         </w:rPr>
-        <w:t>1.0</w:t>
-      </w:r>
-      <w:r>
-        <w:t xml:space="preserve">. This demonstrates that their discourse is highly tribal and self-focused. When crossed with elevated Perspective API toxicity scores, these clusters display the highest overall Polarization Indices (above </w:t>
+        <w:t>\ge 1.0</w:t>
+      </w:r>
+      <w:r>
+        <w:t xml:space="preserve">. This demonstrates that their discourse is highly self-referential and focused on group identity. When crossed with elevated Perspective API toxicity scores, these clusters display the highest overall Polarization Indices (above </w:t>
       </w:r>
       <w:r>
         <w:rPr>
@@ -2562,16 +2988,7 @@
         <w:t>0.45</w:t>
       </w:r>
       <w:r>
-        <w:t>).</w:t>
-      </w:r>
-    </w:p>
-    <w:p>
-      <w:pPr>
-        <w:spacing w:line="276" w:lineRule="auto" w:after="120"/>
-        <w:jc w:val="both"/>
-      </w:pPr>
-      <w:r>
-        <w:t>Conversely, mainstream media channels (Cluster 2) maintain a very low We/Them ratio (</w:t>
+        <w:t>). Conversely, mainstream media channels (Cluster 2) maintain a very low We/Them ratio (</w:t>
       </w:r>
       <w:r>
         <w:rPr>
@@ -2597,8 +3014,279 @@
       </w:r>
     </w:p>
     <w:p>
-      <w:r>
-        <w:br w:type="page"/>
+      <w:pPr>
+        <w:spacing w:line="240" w:lineRule="auto" w:after="120"/>
+        <w:jc w:val="both"/>
+      </w:pPr>
+      <w:r>
+        <w:t>The relationship between in-group tribalism and toxicity across communities is visualized in the heatmap below:</w:t>
+      </w:r>
+    </w:p>
+    <w:p>
+      <w:pPr>
+        <w:spacing w:line="240" w:lineRule="auto" w:after="120"/>
+        <w:jc w:val="both"/>
+      </w:pPr>
+      <w:r>
+        <w:t>![Community Polarization Heatmap](figures/cluster_polarization_heatmap.png)</w:t>
+      </w:r>
+    </w:p>
+    <w:p>
+      <w:pPr>
+        <w:spacing w:line="240" w:lineRule="auto" w:after="120"/>
+        <w:jc w:val="both"/>
+      </w:pPr>
+      <w:r/>
+      <w:r>
+        <w:rPr>
+          <w:i/>
+        </w:rPr>
+        <w:t>Figure 3: Heatmap of We/Them Ratio, Mean Toxicity, and Polarization Index across Louvain communities.</w:t>
+      </w:r>
+      <w:r/>
+    </w:p>
+    <w:p>
+      <w:pPr>
+        <w:spacing w:before="240" w:after="120"/>
+      </w:pPr>
+      <w:r>
+        <w:rPr>
+          <w:rFonts w:ascii="Calibri" w:hAnsi="Calibri"/>
+          <w:b/>
+          <w:color w:val="3B82F6"/>
+          <w:sz w:val="24"/>
+        </w:rPr>
+        <w:t>E. WebGL-Accelerated Dashboard UI</w:t>
+      </w:r>
+    </w:p>
+    <w:p>
+      <w:pPr>
+        <w:spacing w:line="240" w:lineRule="auto" w:after="120"/>
+        <w:jc w:val="both"/>
+      </w:pPr>
+      <w:r>
+        <w:t>To make these findings accessible, we designed an interactive Streamlit dashboard optimized for standard client hardware:</w:t>
+      </w:r>
+    </w:p>
+    <w:p>
+      <w:pPr>
+        <w:spacing w:line="240" w:lineRule="auto" w:after="120"/>
+        <w:ind w:left="576"/>
+      </w:pPr>
+      <w:r>
+        <w:rPr>
+          <w:b/>
+        </w:rPr>
+        <w:t xml:space="preserve">1.  </w:t>
+      </w:r>
+      <w:r/>
+      <w:r>
+        <w:rPr>
+          <w:b/>
+        </w:rPr>
+        <w:t>Flat, Sober UI</w:t>
+      </w:r>
+      <w:r>
+        <w:t>: In accordance with the academic constraints, we removed default Streamlit styling and configured the navigation sidebar as a flat list of plain-text options. The selected option is styled in bold sapphire blue (`#3B82F6`) and prepended with a classic text arrow `&gt; ` (e.g., `&gt; 3. Polarization &amp; Toxicity`), keeping the background transparent.</w:t>
+      </w:r>
+    </w:p>
+    <w:p>
+      <w:pPr>
+        <w:spacing w:line="240" w:lineRule="auto" w:after="120"/>
+        <w:ind w:left="576"/>
+      </w:pPr>
+      <w:r>
+        <w:rPr>
+          <w:b/>
+        </w:rPr>
+        <w:t xml:space="preserve">2.  </w:t>
+      </w:r>
+      <w:r/>
+      <w:r>
+        <w:rPr>
+          <w:b/>
+        </w:rPr>
+        <w:t>Relative Column-Wise Heatmap Normalization</w:t>
+      </w:r>
+      <w:r>
+        <w:t xml:space="preserve">: Because absolute toxicity and polarization scores reside in narrow bands (e.g., toxicity ranges from </w:t>
+      </w:r>
+      <w:r>
+        <w:rPr>
+          <w:rFonts w:ascii="Consolas" w:hAnsi="Consolas"/>
+          <w:color w:val="781414"/>
+          <w:sz w:val="20"/>
+        </w:rPr>
+        <w:t>0.38</w:t>
+      </w:r>
+      <w:r>
+        <w:t xml:space="preserve"> to </w:t>
+      </w:r>
+      <w:r>
+        <w:rPr>
+          <w:rFonts w:ascii="Consolas" w:hAnsi="Consolas"/>
+          <w:color w:val="781414"/>
+          <w:sz w:val="20"/>
+        </w:rPr>
+        <w:t>0.52</w:t>
+      </w:r>
+      <w:r>
+        <w:t xml:space="preserve">), placing them on an absolute </w:t>
+      </w:r>
+      <w:r>
+        <w:rPr>
+          <w:rFonts w:ascii="Consolas" w:hAnsi="Consolas"/>
+          <w:color w:val="781414"/>
+          <w:sz w:val="20"/>
+        </w:rPr>
+        <w:t>[0, 1]</w:t>
+      </w:r>
+      <w:r>
+        <w:t xml:space="preserve"> scale flattens the visual contrast. We applied column-level min-max normalization to stretch the color gradient from green to red, while annotating the absolute raw metrics inside the cells to maintain transparency.</w:t>
+      </w:r>
+    </w:p>
+    <w:p>
+      <w:pPr>
+        <w:spacing w:line="240" w:lineRule="auto" w:after="120"/>
+        <w:ind w:left="576"/>
+      </w:pPr>
+      <w:r>
+        <w:rPr>
+          <w:b/>
+        </w:rPr>
+        <w:t xml:space="preserve">3.  </w:t>
+      </w:r>
+      <w:r/>
+      <w:r>
+        <w:rPr>
+          <w:b/>
+        </w:rPr>
+        <w:t>Plotly WebGL Acceleration</w:t>
+      </w:r>
+      <w:r>
+        <w:t>: Rendering the 20,641 nodes via standard SVG elements caused browser crashes. We implemented Plotly WebGL (`go.Scattergl`), shifting layout matrices directly to the client's GPU, and implemented memory caching (`@st.cache_data`) to prevent reload lag.</w:t>
+      </w:r>
+    </w:p>
+    <w:p>
+      <w:pPr>
+        <w:spacing w:before="240" w:after="120"/>
+      </w:pPr>
+      <w:r>
+        <w:rPr>
+          <w:rFonts w:ascii="Calibri" w:hAnsi="Calibri"/>
+          <w:b/>
+          <w:color w:val="3B82F6"/>
+          <w:sz w:val="24"/>
+        </w:rPr>
+        <w:t>F. Technical Challenges and Difficulties</w:t>
+      </w:r>
+    </w:p>
+    <w:p>
+      <w:pPr>
+        <w:spacing w:line="240" w:lineRule="auto" w:after="120"/>
+        <w:jc w:val="both"/>
+      </w:pPr>
+      <w:r>
+        <w:t>During development, we resolved several technical bottlenecks:</w:t>
+      </w:r>
+    </w:p>
+    <w:p>
+      <w:pPr>
+        <w:spacing w:line="240" w:lineRule="auto" w:after="120"/>
+        <w:ind w:left="576"/>
+      </w:pPr>
+      <w:r>
+        <w:rPr>
+          <w:b/>
+        </w:rPr>
+        <w:t xml:space="preserve">1.  </w:t>
+      </w:r>
+      <w:r/>
+      <w:r>
+        <w:rPr>
+          <w:b/>
+        </w:rPr>
+        <w:t>API Access Restrictions</w:t>
+      </w:r>
+      <w:r>
+        <w:t>: Recent API changes on Twitter and Reddit blocked programmatic scraping. We resolved this by integrating static academic datasets from Hugging Face for Reddit and Twitter, while writing custom comment scrapers in `yt-dlp` for YouTube.</w:t>
+      </w:r>
+    </w:p>
+    <w:p>
+      <w:pPr>
+        <w:spacing w:line="240" w:lineRule="auto" w:after="120"/>
+        <w:ind w:left="576"/>
+      </w:pPr>
+      <w:r>
+        <w:rPr>
+          <w:b/>
+        </w:rPr>
+        <w:t xml:space="preserve">2.  </w:t>
+      </w:r>
+      <w:r/>
+      <w:r>
+        <w:rPr>
+          <w:b/>
+        </w:rPr>
+        <w:t>Perspective API Rate Limits</w:t>
+      </w:r>
+      <w:r>
+        <w:t>: The Perspective API enforces a strict rate limit of 1 Query Per Second (QPS). Querying large text corpora directly caused connection failures. We implemented a sampling method (selecting a representative subset of 20 texts per community) and added a strict 1.1-second sleep delay wrapper to stay within the QPS quota.</w:t>
+      </w:r>
+    </w:p>
+    <w:p>
+      <w:pPr>
+        <w:spacing w:line="240" w:lineRule="auto" w:after="120"/>
+        <w:ind w:left="576"/>
+      </w:pPr>
+      <w:r>
+        <w:rPr>
+          <w:b/>
+        </w:rPr>
+        <w:t xml:space="preserve">3.  </w:t>
+      </w:r>
+      <w:r/>
+      <w:r>
+        <w:rPr>
+          <w:b/>
+        </w:rPr>
+        <w:t>Local Multimodal Inference</w:t>
+      </w:r>
+      <w:r>
+        <w:t>: Running CLIP on local machines posed memory and CPU constraints. We solved this by using the `clip-vit-base-patch32` variant and implementing dynamic PyTorch device mapping to route calculations to Metal Performance Shaders (MPS) on Apple Silicon or CUDA on NVIDIA GPUs.</w:t>
+      </w:r>
+    </w:p>
+    <w:p>
+      <w:pPr>
+        <w:spacing w:line="240" w:lineRule="auto" w:after="120"/>
+        <w:ind w:left="576"/>
+      </w:pPr>
+      <w:r>
+        <w:rPr>
+          <w:b/>
+        </w:rPr>
+        <w:t xml:space="preserve">4.  </w:t>
+      </w:r>
+      <w:r/>
+      <w:r>
+        <w:rPr>
+          <w:b/>
+        </w:rPr>
+        <w:t>Graph Rendering Latency</w:t>
+      </w:r>
+      <w:r>
+        <w:t xml:space="preserve">: Displaying large-scale cross-platform graphs in the browser caused rendering bottlenecks. Pruning nodes with degree </w:t>
+      </w:r>
+      <w:r>
+        <w:rPr>
+          <w:rFonts w:ascii="Consolas" w:hAnsi="Consolas"/>
+          <w:color w:val="781414"/>
+          <w:sz w:val="20"/>
+        </w:rPr>
+        <w:t>&lt; 3</w:t>
+      </w:r>
+      <w:r>
+        <w:t xml:space="preserve"> eliminated topological noise (reducing nodes from 20,641 to a manageable set), and rendering via Plotly WebGL resolved DOM rendering lags.</w:t>
       </w:r>
     </w:p>
     <w:p>
@@ -2612,60 +3300,16 @@
           <w:color w:val="3B82F6"/>
           <w:sz w:val="28"/>
         </w:rPr>
-        <w:t>V. DASHBOARD IMPLEMENTATION</w:t>
+        <w:t>IV. CONCLUSION</w:t>
       </w:r>
     </w:p>
     <w:p>
       <w:pPr>
-        <w:spacing w:line="276" w:lineRule="auto" w:after="120"/>
+        <w:spacing w:line="240" w:lineRule="auto" w:after="120"/>
         <w:jc w:val="both"/>
       </w:pPr>
       <w:r>
-        <w:t>To render these scientific findings accessible, we designed an interactive Streamlit dashboard. The application is optimized to run smoothly on standard client hardware:</w:t>
-      </w:r>
-    </w:p>
-    <w:p>
-      <w:pPr>
-        <w:spacing w:line="276" w:lineRule="auto" w:after="120"/>
-        <w:ind w:left="576"/>
-      </w:pPr>
-      <w:r>
-        <w:rPr>
-          <w:b/>
-        </w:rPr>
-        <w:t xml:space="preserve">1.  </w:t>
-      </w:r>
-      <w:r/>
-      <w:r>
-        <w:rPr>
-          <w:b/>
-        </w:rPr>
-        <w:t>Flat, Documentation-Like UI</w:t>
-      </w:r>
-      <w:r>
-        <w:t>: In accordance with academic design constraints (GEMINI.md), we removed flashy Streamlit components and styled the navigation sidebar as a flat, vertical list of plain-text options. The active page is highlighted using a bold, sapphire-blue font (`#3B82F6`) prepended with a classic text arrow `&gt; ` (e.g., `&gt; 3. Polarization &amp; Toxicity`), while maintaining a transparent background.</w:t>
-      </w:r>
-    </w:p>
-    <w:p>
-      <w:pPr>
-        <w:spacing w:line="276" w:lineRule="auto" w:after="120"/>
-        <w:ind w:left="576"/>
-      </w:pPr>
-      <w:r>
-        <w:rPr>
-          <w:b/>
-        </w:rPr>
-        <w:t xml:space="preserve">2.  </w:t>
-      </w:r>
-      <w:r/>
-      <w:r>
-        <w:rPr>
-          <w:b/>
-        </w:rPr>
-        <w:t>Relative Column-Wise Heatmap Normalization</w:t>
-      </w:r>
-      <w:r>
-        <w:t xml:space="preserve">: Because absolute toxicity and polarization averages reside in narrow bands (e.g., toxicity ranges from </w:t>
+        <w:t>This paper has presented a unified, multi-layered computational framework to model and quantify social media polarization across heterogeneous platforms. By integrating deep learning semantics (Google Perspective API, OpenAI CLIP), network science topology (Louvain community detection), and hardware-accelerated interactive visualizations (Streamlit, Plotly WebGL), our pipeline successfully identified dense cross-platform echo chambers (</w:t>
       </w:r>
       <w:r>
         <w:rPr>
@@ -2673,70 +3317,10 @@
           <w:color w:val="781414"/>
           <w:sz w:val="20"/>
         </w:rPr>
-        <w:t>0.38</w:t>
-      </w:r>
-      <w:r>
-        <w:t xml:space="preserve"> to </w:t>
-      </w:r>
-      <w:r>
-        <w:rPr>
-          <w:rFonts w:ascii="Consolas" w:hAnsi="Consolas"/>
-          <w:color w:val="781414"/>
-          <w:sz w:val="20"/>
-        </w:rPr>
-        <w:t>0.52</w:t>
-      </w:r>
-      <w:r>
-        <w:t xml:space="preserve">), placing them on an absolute </w:t>
-      </w:r>
-      <w:r>
-        <w:rPr>
-          <w:rFonts w:ascii="Consolas" w:hAnsi="Consolas"/>
-          <w:color w:val="781414"/>
-          <w:sz w:val="20"/>
-        </w:rPr>
-        <w:t>[0, 1]</w:t>
-      </w:r>
-      <w:r>
-        <w:t xml:space="preserve"> scale flattens the visual contrast. We applied individual min-max column normalization to stretch color contrasts from green to red, while annotating the absolute raw metrics directly inside the cells to ensure transparency.</w:t>
-      </w:r>
-    </w:p>
-    <w:p>
-      <w:pPr>
-        <w:spacing w:line="276" w:lineRule="auto" w:after="120"/>
-        <w:ind w:left="576"/>
-      </w:pPr>
-      <w:r>
-        <w:rPr>
-          <w:b/>
-        </w:rPr>
-        <w:t xml:space="preserve">3.  </w:t>
-      </w:r>
-      <w:r/>
-      <w:r>
-        <w:rPr>
-          <w:b/>
-        </w:rPr>
-        <w:t>Plotly WebGL Acceleration</w:t>
-      </w:r>
-      <w:r>
-        <w:t>: To display the massive cross-platform network (</w:t>
-      </w:r>
-      <w:r>
-        <w:rPr>
-          <w:rFonts w:ascii="Consolas" w:hAnsi="Consolas"/>
-          <w:color w:val="781414"/>
-          <w:sz w:val="20"/>
-        </w:rPr>
-        <w:t>20,641</w:t>
-      </w:r>
-      <w:r>
-        <w:t xml:space="preserve"> nodes), we implemented WebGL markers and lines (`go.Scattergl`). This shifts matrix rendering directly onto the client's GPU, avoiding the CPU and browser bottlenecks caused by standard SVG elements. Memory caching via the `@st.cache_data` decorator ensures that heavy database and centrality calculations are stored, maintaining interface responsiveness during user interactions.</w:t>
-      </w:r>
-    </w:p>
-    <w:p>
-      <w:r>
-        <w:br w:type="page"/>
+        <w:t>Q = 0.9539</w:t>
+      </w:r>
+      <w:r>
+        <w:t>) and demonstrated the mathematical relationship between linguistic in-group tribalism and community hostility. The formulated Polarization Index effectively highlighted hostile partisan clusters while cleanly separating neutral mainstream journalistic networks. Additionally, the local CLIP pipeline revealed that out-group political memes frequently exploit low visual-textual semantic alignment to disseminate hostility, presenting a key vector of discursive fragmentation that traditional text-only classifiers omit. This unified architecture offers computational social scientists and platforms a scalable, rigorous tool to monitor the structural and discursive health of online public debate. Future work will focus on integrating decentralized open APIs (such as Bluesky and Mastodon) and deploying local, open-weights large language models to compute offline contextual toxicity and mitigate rate-limiting barriers.</w:t>
       </w:r>
     </w:p>
     <w:p>
@@ -2750,127 +3334,12 @@
           <w:color w:val="3B82F6"/>
           <w:sz w:val="28"/>
         </w:rPr>
-        <w:t>VI. DISCUSSION &amp; FUTURE WORK</w:t>
+        <w:t>V. REFERENCES</w:t>
       </w:r>
     </w:p>
     <w:p>
       <w:pPr>
-        <w:spacing w:line="276" w:lineRule="auto" w:after="120"/>
-        <w:jc w:val="both"/>
-      </w:pPr>
-      <w:r>
-        <w:t>The results presented in this paper demonstrate the feasibility of multi-platform tracking. However, several technical and structural limitations persist:</w:t>
-      </w:r>
-    </w:p>
-    <w:p>
-      <w:pPr>
-        <w:spacing w:line="276" w:lineRule="auto" w:after="120"/>
-        <w:ind w:left="576"/>
-      </w:pPr>
-      <w:r>
-        <w:rPr>
-          <w:b/>
-        </w:rPr>
-        <w:t xml:space="preserve">•  </w:t>
-      </w:r>
-      <w:r>
-        <w:t xml:space="preserve">  </w:t>
-      </w:r>
-      <w:r>
-        <w:rPr>
-          <w:b/>
-        </w:rPr>
-        <w:t>API Restriction Barriers</w:t>
-      </w:r>
-      <w:r>
-        <w:t>: Recent changes to social media APIs (especially Twitter and Reddit) have heavily restricted programmatic scraping. While we resolved this by utilizing high-quality academic datasets from Hugging Face, future implementations will focus on integrating decentralized open APIs (such as Mastodon and Bluesky).</w:t>
-      </w:r>
-    </w:p>
-    <w:p>
-      <w:pPr>
-        <w:spacing w:line="276" w:lineRule="auto" w:after="120"/>
-        <w:ind w:left="576"/>
-      </w:pPr>
-      <w:r>
-        <w:rPr>
-          <w:b/>
-        </w:rPr>
-        <w:t xml:space="preserve">•  </w:t>
-      </w:r>
-      <w:r>
-        <w:t xml:space="preserve">  </w:t>
-      </w:r>
-      <w:r>
-        <w:rPr>
-          <w:b/>
-        </w:rPr>
-        <w:t>GPT Context Limitations</w:t>
-      </w:r>
-      <w:r>
-        <w:t>: Evaluating large text corpora via external APIs is bounded by strict rate-limiting (e.g., Perspective API's 1 QPS limit). We bypassed this by sampling 20 representative texts per community. Future research will explore local, fine-tuned Llama-3 or Mistral models to perform offline toxicity scoring without external dependencies or latency bottlenecks.</w:t>
-      </w:r>
-    </w:p>
-    <w:p>
-      <w:r>
-        <w:br w:type="page"/>
-      </w:r>
-    </w:p>
-    <w:p>
-      <w:pPr>
-        <w:spacing w:before="240" w:after="120"/>
-      </w:pPr>
-      <w:r>
-        <w:rPr>
-          <w:rFonts w:ascii="Calibri" w:hAnsi="Calibri"/>
-          <w:b/>
-          <w:color w:val="3B82F6"/>
-          <w:sz w:val="28"/>
-        </w:rPr>
-        <w:t>VII. CONCLUSION</w:t>
-      </w:r>
-    </w:p>
-    <w:p>
-      <w:pPr>
-        <w:spacing w:line="276" w:lineRule="auto" w:after="120"/>
-        <w:jc w:val="both"/>
-      </w:pPr>
-      <w:r>
-        <w:t>This paper has presented a unified, multi-layered computational framework to model and quantify social media polarization. By combining deep learning NLP (Google Perspective API, OpenAI CLIP), network science modularity (Louvain community detection), and hardware-optimized visualization (Streamlit, Plotly WebGL), our pipeline successfully identified dense cross-platform echo chambers (</w:t>
-      </w:r>
-      <w:r>
-        <w:rPr>
-          <w:rFonts w:ascii="Consolas" w:hAnsi="Consolas"/>
-          <w:color w:val="781414"/>
-          <w:sz w:val="20"/>
-        </w:rPr>
-        <w:t>Q = 0.9539</w:t>
-      </w:r>
-      <w:r>
-        <w:t>) and proved the mathematical relationship between linguistic in-group tribalism and community hostility. The Polarization Index successfully highlighted the most hostile partisan groups while clearly isolating neutral mainstream news vectors. This unified approach provides computational social scientists and researchers with a scalable, rigorous tool to monitor the health of online public discourse.</w:t>
-      </w:r>
-    </w:p>
-    <w:p>
-      <w:r>
-        <w:br w:type="page"/>
-      </w:r>
-    </w:p>
-    <w:p>
-      <w:pPr>
-        <w:spacing w:before="240" w:after="120"/>
-      </w:pPr>
-      <w:r>
-        <w:rPr>
-          <w:rFonts w:ascii="Calibri" w:hAnsi="Calibri"/>
-          <w:b/>
-          <w:color w:val="3B82F6"/>
-          <w:sz w:val="28"/>
-        </w:rPr>
-        <w:t>REFERENCES</w:t>
-      </w:r>
-    </w:p>
-    <w:p>
-      <w:pPr>
-        <w:spacing w:line="276" w:lineRule="auto" w:after="120"/>
+        <w:spacing w:line="240" w:lineRule="auto" w:after="120"/>
         <w:ind w:left="576"/>
       </w:pPr>
       <w:r>
@@ -2894,7 +3363,7 @@
     </w:p>
     <w:p>
       <w:pPr>
-        <w:spacing w:line="276" w:lineRule="auto" w:after="120"/>
+        <w:spacing w:line="240" w:lineRule="auto" w:after="120"/>
         <w:ind w:left="576"/>
       </w:pPr>
       <w:r>
@@ -2918,7 +3387,7 @@
     </w:p>
     <w:p>
       <w:pPr>
-        <w:spacing w:line="276" w:lineRule="auto" w:after="120"/>
+        <w:spacing w:line="240" w:lineRule="auto" w:after="120"/>
         <w:ind w:left="576"/>
       </w:pPr>
       <w:r>
@@ -2942,7 +3411,7 @@
     </w:p>
     <w:p>
       <w:pPr>
-        <w:spacing w:line="276" w:lineRule="auto" w:after="120"/>
+        <w:spacing w:line="240" w:lineRule="auto" w:after="120"/>
         <w:ind w:left="576"/>
       </w:pPr>
       <w:r>
@@ -2957,7 +3426,7 @@
     </w:p>
     <w:p>
       <w:pPr>
-        <w:spacing w:line="276" w:lineRule="auto" w:after="120"/>
+        <w:spacing w:line="240" w:lineRule="auto" w:after="120"/>
         <w:ind w:left="576"/>
       </w:pPr>
       <w:r>
@@ -2981,13 +3450,49 @@
     </w:p>
     <w:sectPr>
       <w:headerReference w:type="default" r:id="rId9"/>
+      <w:footerReference w:type="default" r:id="rId10"/>
       <w:pgSz w:w="12240" w:h="15840"/>
       <w:pgMar w:top="1440" w:right="1440" w:bottom="1440" w:left="1440" w:header="720" w:footer="720" w:gutter="0"/>
       <w:cols w:space="720"/>
+      <w:titlePg/>
       <w:docGrid w:linePitch="360"/>
     </w:sectPr>
   </w:body>
 </w:document>
+</file>
+
+<file path=word/footer1.xml><?xml version="1.0" encoding="utf-8"?>
+<w:ftr xmlns:m="http://schemas.openxmlformats.org/officeDocument/2006/math" xmlns:mc="http://schemas.openxmlformats.org/markup-compatibility/2006" xmlns:mo="http://schemas.microsoft.com/office/mac/office/2008/main" xmlns:mv="urn:schemas-microsoft-com:mac:vml" xmlns:o="urn:schemas-microsoft-com:office:office" xmlns:r="http://schemas.openxmlformats.org/officeDocument/2006/relationships" xmlns:v="urn:schemas-microsoft-com:vml" xmlns:w10="urn:schemas-microsoft-com:office:word" xmlns:w14="http://schemas.microsoft.com/office/word/2010/wordml" xmlns:w="http://schemas.openxmlformats.org/wordprocessingml/2006/main" xmlns:wne="http://schemas.microsoft.com/office/word/2006/wordml" xmlns:wp14="http://schemas.microsoft.com/office/word/2010/wordprocessingDrawing" xmlns:wp="http://schemas.openxmlformats.org/drawingml/2006/wordprocessingDrawing" xmlns:wpc="http://schemas.microsoft.com/office/word/2010/wordprocessingCanvas" xmlns:wpg="http://schemas.microsoft.com/office/word/2010/wordprocessingGroup" xmlns:wpi="http://schemas.microsoft.com/office/word/2010/wordprocessingInk" xmlns:wps="http://schemas.microsoft.com/office/word/2010/wordprocessingShape" mc:Ignorable="w14 wp14">
+  <w:p>
+    <w:pPr>
+      <w:pStyle w:val="Footer"/>
+      <w:tabs>
+        <w:tab w:pos="9360" w:val="right"/>
+      </w:tabs>
+      <w:jc w:val="left"/>
+    </w:pPr>
+    <w:r>
+      <w:rPr>
+        <w:rFonts w:ascii="Calibri" w:hAnsi="Calibri"/>
+        <w:color w:val="787878"/>
+        <w:sz w:val="17"/>
+      </w:rPr>
+      <w:t>Milan LOI | ÉTUDE DE LA POLARISATION DISCURSIVE</w:t>
+      <w:tab/>
+    </w:r>
+    <w:r>
+      <w:rPr>
+        <w:rFonts w:ascii="Calibri" w:hAnsi="Calibri"/>
+        <w:color w:val="787878"/>
+        <w:sz w:val="17"/>
+      </w:rPr>
+      <w:fldChar w:fldCharType="begin"/>
+      <w:instrText xml:space="preserve">PAGE</w:instrText>
+      <w:fldChar w:fldCharType="separate"/>
+      <w:fldChar w:fldCharType="end"/>
+    </w:r>
+  </w:p>
+</w:ftr>
 </file>
 
 <file path=word/header1.xml><?xml version="1.0" encoding="utf-8"?>

</xml_diff>